<commit_message>
docs(aan): pull #1089 data + regression fixes + Book_00 dense-text restructure
- Cherry-pick two PR #1089 commits: fix stale roadmap/track/catalog counts (17 books)
- Book_19 checklist: "18 books" → "19 books"
- Book_00 Phase 4 + references table: "29/29 satisfied" → "29/29 self-assessed, pending 3PAO validation"
- Book_00 exec-summary opening paragraph: 9-sentence wall-of-text → four labeled bands with per-book bullets
- Book_00 Parts 2–4 "What This Document Addresses": three dense paragraphs → bulleted capability lists
- Rebuild docx for Book_00 and Book_19; rebuild AAN_Federal_Series_Complete.zip
</commit_message>
<xml_diff>
--- a/inbox/Application Aware Networking/Book_00_FedAAN_Executive_Summary.docx
+++ b/inbox/Application Aware Networking/Book_00_FedAAN_Executive_Summary.docx
@@ -85,7 +85,131 @@
         <w:pStyle w:val="BodyText"/>
       </w:pPr>
       <w:r>
-        <w:t xml:space="preserve">This document summarizes nineteen companion implementation guides that together constitute the Federal Application-Aware Networking program. Books 01–04 lay the substrate: the DDI/IPAM naming-and-addressing plane (16 controls), 802.1X network access control closing the device-identity gap at the network port, the certificate-and-token cryptographic identity layer that every session-less architecture depends on, and the HRIT identity and organizational single source of truth — the SaaS-delivered HR system of record whose worker and organizational records are what every token, account, and access decision ultimately asserts. Books 05–09 deliver the modernization tracks — network and identity architecture (Entra ID + ZTNA + Active Governance), telecommunications (SD-WAN + SASE), SQL Server authentication, and database architecture and network physics — closing</w:t>
+        <w:t xml:space="preserve">This series comprises nineteen companion implementation guides for the Federal Application-Aware Networking program, organized in four bands:</w:t>
+      </w:r>
+    </w:p>
+    <w:p>
+      <w:pPr>
+        <w:pStyle w:val="BodyText"/>
+      </w:pPr>
+      <w:r>
+        <w:rPr>
+          <w:b/>
+          <w:bCs/>
+        </w:rPr>
+        <w:t xml:space="preserve">Books 01–04 — Substrate</w:t>
+      </w:r>
+      <w:r>
+        <w:t xml:space="preserve"> </w:t>
+      </w:r>
+      <w:r>
+        <w:t xml:space="preserve">(naming, identity, and trust foundations):</w:t>
+      </w:r>
+    </w:p>
+    <w:p>
+      <w:pPr>
+        <w:pStyle w:val="Compact"/>
+        <w:numPr>
+          <w:ilvl w:val="0"/>
+          <w:numId w:val="1001"/>
+        </w:numPr>
+      </w:pPr>
+      <w:r>
+        <w:rPr>
+          <w:b/>
+          <w:bCs/>
+        </w:rPr>
+        <w:t xml:space="preserve">Book 01</w:t>
+      </w:r>
+      <w:r>
+        <w:t xml:space="preserve"> </w:t>
+      </w:r>
+      <w:r>
+        <w:t xml:space="preserve">— DDI/IPAM naming-and-addressing plane — 16 NIST SP 800-53 Rev 5 controls</w:t>
+      </w:r>
+    </w:p>
+    <w:p>
+      <w:pPr>
+        <w:pStyle w:val="Compact"/>
+        <w:numPr>
+          <w:ilvl w:val="0"/>
+          <w:numId w:val="1001"/>
+        </w:numPr>
+      </w:pPr>
+      <w:r>
+        <w:rPr>
+          <w:b/>
+          <w:bCs/>
+        </w:rPr>
+        <w:t xml:space="preserve">Book 02</w:t>
+      </w:r>
+      <w:r>
+        <w:t xml:space="preserve"> </w:t>
+      </w:r>
+      <w:r>
+        <w:t xml:space="preserve">— Network Access Control (802.1X EAP-TLS, RADIUS, device identity at the port)</w:t>
+      </w:r>
+    </w:p>
+    <w:p>
+      <w:pPr>
+        <w:pStyle w:val="Compact"/>
+        <w:numPr>
+          <w:ilvl w:val="0"/>
+          <w:numId w:val="1001"/>
+        </w:numPr>
+      </w:pPr>
+      <w:r>
+        <w:rPr>
+          <w:b/>
+          <w:bCs/>
+        </w:rPr>
+        <w:t xml:space="preserve">Book 03</w:t>
+      </w:r>
+      <w:r>
+        <w:t xml:space="preserve"> </w:t>
+      </w:r>
+      <w:r>
+        <w:t xml:space="preserve">— Certificates &amp; Tokens — the cryptographic identity layer every session-less architecture depends on</w:t>
+      </w:r>
+    </w:p>
+    <w:p>
+      <w:pPr>
+        <w:pStyle w:val="Compact"/>
+        <w:numPr>
+          <w:ilvl w:val="0"/>
+          <w:numId w:val="1001"/>
+        </w:numPr>
+      </w:pPr>
+      <w:r>
+        <w:rPr>
+          <w:b/>
+          <w:bCs/>
+        </w:rPr>
+        <w:t xml:space="preserve">Book 04</w:t>
+      </w:r>
+      <w:r>
+        <w:t xml:space="preserve"> </w:t>
+      </w:r>
+      <w:r>
+        <w:t xml:space="preserve">— HRIT Identity &amp; Org SSOT — the HR system of record whose worker records underpin every token, account, and access decision</w:t>
+      </w:r>
+    </w:p>
+    <w:p>
+      <w:pPr>
+        <w:pStyle w:val="FirstParagraph"/>
+      </w:pPr>
+      <w:r>
+        <w:rPr>
+          <w:b/>
+          <w:bCs/>
+        </w:rPr>
+        <w:t xml:space="preserve">Books 05–09 — Modernization Tracks</w:t>
+      </w:r>
+      <w:r>
+        <w:t xml:space="preserve"> </w:t>
+      </w:r>
+      <w:r>
+        <w:t xml:space="preserve">— closing</w:t>
       </w:r>
       <w:r>
         <w:t xml:space="preserve"> </w:t>
@@ -101,7 +225,113 @@
         <w:t xml:space="preserve"> </w:t>
       </w:r>
       <w:r>
-        <w:t xml:space="preserve">across the original six tracks. Books 10–14 extend coverage to privileged access management, vulnerability management, data protection, SIEM/XDR detection engineering, and business continuity — adding approximately</w:t>
+        <w:t xml:space="preserve">across the original six tracks:</w:t>
+      </w:r>
+    </w:p>
+    <w:p>
+      <w:pPr>
+        <w:pStyle w:val="Compact"/>
+        <w:numPr>
+          <w:ilvl w:val="0"/>
+          <w:numId w:val="1002"/>
+        </w:numPr>
+      </w:pPr>
+      <w:r>
+        <w:rPr>
+          <w:b/>
+          <w:bCs/>
+        </w:rPr>
+        <w:t xml:space="preserve">Book 05</w:t>
+      </w:r>
+      <w:r>
+        <w:t xml:space="preserve"> </w:t>
+      </w:r>
+      <w:r>
+        <w:t xml:space="preserve">— Network and Identity Modernization (Entra ID, ZTNA, Active Governance)</w:t>
+      </w:r>
+    </w:p>
+    <w:p>
+      <w:pPr>
+        <w:pStyle w:val="Compact"/>
+        <w:numPr>
+          <w:ilvl w:val="0"/>
+          <w:numId w:val="1002"/>
+        </w:numPr>
+      </w:pPr>
+      <w:r>
+        <w:rPr>
+          <w:b/>
+          <w:bCs/>
+        </w:rPr>
+        <w:t xml:space="preserve">Book 06</w:t>
+      </w:r>
+      <w:r>
+        <w:t xml:space="preserve"> </w:t>
+      </w:r>
+      <w:r>
+        <w:t xml:space="preserve">— Federal Telecommunications Modernization (SD-WAN, SASE)</w:t>
+      </w:r>
+    </w:p>
+    <w:p>
+      <w:pPr>
+        <w:pStyle w:val="Compact"/>
+        <w:numPr>
+          <w:ilvl w:val="0"/>
+          <w:numId w:val="1002"/>
+        </w:numPr>
+      </w:pPr>
+      <w:r>
+        <w:rPr>
+          <w:b/>
+          <w:bCs/>
+        </w:rPr>
+        <w:t xml:space="preserve">Books 07–08</w:t>
+      </w:r>
+      <w:r>
+        <w:t xml:space="preserve"> </w:t>
+      </w:r>
+      <w:r>
+        <w:t xml:space="preserve">— SQL Server Authentication Modernization and Implementation Guide</w:t>
+      </w:r>
+    </w:p>
+    <w:p>
+      <w:pPr>
+        <w:pStyle w:val="Compact"/>
+        <w:numPr>
+          <w:ilvl w:val="0"/>
+          <w:numId w:val="1002"/>
+        </w:numPr>
+      </w:pPr>
+      <w:r>
+        <w:rPr>
+          <w:b/>
+          <w:bCs/>
+        </w:rPr>
+        <w:t xml:space="preserve">Book 09</w:t>
+      </w:r>
+      <w:r>
+        <w:t xml:space="preserve"> </w:t>
+      </w:r>
+      <w:r>
+        <w:t xml:space="preserve">— Database Consolidation and Network Physics</w:t>
+      </w:r>
+    </w:p>
+    <w:p>
+      <w:pPr>
+        <w:pStyle w:val="FirstParagraph"/>
+      </w:pPr>
+      <w:r>
+        <w:rPr>
+          <w:b/>
+          <w:bCs/>
+        </w:rPr>
+        <w:t xml:space="preserve">Books 10–14 — Security Operations</w:t>
+      </w:r>
+      <w:r>
+        <w:t xml:space="preserve"> </w:t>
+      </w:r>
+      <w:r>
+        <w:t xml:space="preserve">— approximately</w:t>
       </w:r>
       <w:r>
         <w:t xml:space="preserve"> </w:t>
@@ -117,7 +347,245 @@
         <w:t xml:space="preserve"> </w:t>
       </w:r>
       <w:r>
-        <w:t xml:space="preserve">across the AC, RA, MP, SC, AU, SI, IR, and CP families. Books 15–17 close the remaining SR, PM, and PT control families — supply chain risk management (SBOM/VDR/VEX pipeline), program management governance (POA&amp;M/SCRM/ISPP), and PII processing transparency (PT family templates and Purview enforcement). Book 18 delivers the AT family cybersecurity training program — activating KSI-022 (KSI-CED-RAT) and making all 29 FedRAMP 20x CR26 KSIs evaluable at high confidence. Book 19 assembles the complete FedRAMP 20x authorization package — OSCAL AP+AR+POA&amp;M bundle (29/29 KSIs self-assessed as satisfied, 0 open risks, pending independent 3PAO validation), continuous monitoring program, and BOD 26-04 VDR/VER submission procedure — closing CA-2, CA-5, CA-6, CA-7, RA-3, and SA-15. Together the series constitutes the complete evidence generation and authorization layer required for FedRAMP 20x continuous monitoring authorization.</w:t>
+        <w:t xml:space="preserve">across the AC, RA, MP, SC, AU, SI, IR, and CP families:</w:t>
+      </w:r>
+    </w:p>
+    <w:p>
+      <w:pPr>
+        <w:pStyle w:val="Compact"/>
+        <w:numPr>
+          <w:ilvl w:val="0"/>
+          <w:numId w:val="1003"/>
+        </w:numPr>
+      </w:pPr>
+      <w:r>
+        <w:rPr>
+          <w:b/>
+          <w:bCs/>
+        </w:rPr>
+        <w:t xml:space="preserve">Book 10</w:t>
+      </w:r>
+      <w:r>
+        <w:t xml:space="preserve"> </w:t>
+      </w:r>
+      <w:r>
+        <w:t xml:space="preserve">— Privileged Access Management</w:t>
+      </w:r>
+    </w:p>
+    <w:p>
+      <w:pPr>
+        <w:pStyle w:val="Compact"/>
+        <w:numPr>
+          <w:ilvl w:val="0"/>
+          <w:numId w:val="1003"/>
+        </w:numPr>
+      </w:pPr>
+      <w:r>
+        <w:rPr>
+          <w:b/>
+          <w:bCs/>
+        </w:rPr>
+        <w:t xml:space="preserve">Book 11</w:t>
+      </w:r>
+      <w:r>
+        <w:t xml:space="preserve"> </w:t>
+      </w:r>
+      <w:r>
+        <w:t xml:space="preserve">— Vulnerability Management</w:t>
+      </w:r>
+    </w:p>
+    <w:p>
+      <w:pPr>
+        <w:pStyle w:val="Compact"/>
+        <w:numPr>
+          <w:ilvl w:val="0"/>
+          <w:numId w:val="1003"/>
+        </w:numPr>
+      </w:pPr>
+      <w:r>
+        <w:rPr>
+          <w:b/>
+          <w:bCs/>
+        </w:rPr>
+        <w:t xml:space="preserve">Book 12</w:t>
+      </w:r>
+      <w:r>
+        <w:t xml:space="preserve"> </w:t>
+      </w:r>
+      <w:r>
+        <w:t xml:space="preserve">— Data Protection and Purview</w:t>
+      </w:r>
+    </w:p>
+    <w:p>
+      <w:pPr>
+        <w:pStyle w:val="Compact"/>
+        <w:numPr>
+          <w:ilvl w:val="0"/>
+          <w:numId w:val="1003"/>
+        </w:numPr>
+      </w:pPr>
+      <w:r>
+        <w:rPr>
+          <w:b/>
+          <w:bCs/>
+        </w:rPr>
+        <w:t xml:space="preserve">Book 13</w:t>
+      </w:r>
+      <w:r>
+        <w:t xml:space="preserve"> </w:t>
+      </w:r>
+      <w:r>
+        <w:t xml:space="preserve">— SIEM/XDR Detection Engineering</w:t>
+      </w:r>
+    </w:p>
+    <w:p>
+      <w:pPr>
+        <w:pStyle w:val="Compact"/>
+        <w:numPr>
+          <w:ilvl w:val="0"/>
+          <w:numId w:val="1003"/>
+        </w:numPr>
+      </w:pPr>
+      <w:r>
+        <w:rPr>
+          <w:b/>
+          <w:bCs/>
+        </w:rPr>
+        <w:t xml:space="preserve">Book 14</w:t>
+      </w:r>
+      <w:r>
+        <w:t xml:space="preserve"> </w:t>
+      </w:r>
+      <w:r>
+        <w:t xml:space="preserve">— Business Continuity</w:t>
+      </w:r>
+    </w:p>
+    <w:p>
+      <w:pPr>
+        <w:pStyle w:val="FirstParagraph"/>
+      </w:pPr>
+      <w:r>
+        <w:rPr>
+          <w:b/>
+          <w:bCs/>
+        </w:rPr>
+        <w:t xml:space="preserve">Books 15–17 — Risk and Program Governance</w:t>
+      </w:r>
+      <w:r>
+        <w:t xml:space="preserve"> </w:t>
+      </w:r>
+      <w:r>
+        <w:t xml:space="preserve">(SR, PM, and PT control families):</w:t>
+      </w:r>
+    </w:p>
+    <w:p>
+      <w:pPr>
+        <w:pStyle w:val="Compact"/>
+        <w:numPr>
+          <w:ilvl w:val="0"/>
+          <w:numId w:val="1004"/>
+        </w:numPr>
+      </w:pPr>
+      <w:r>
+        <w:rPr>
+          <w:b/>
+          <w:bCs/>
+        </w:rPr>
+        <w:t xml:space="preserve">Book 15</w:t>
+      </w:r>
+      <w:r>
+        <w:t xml:space="preserve"> </w:t>
+      </w:r>
+      <w:r>
+        <w:t xml:space="preserve">— Supply Chain Risk Management (SBOM/VDR/VEX pipeline)</w:t>
+      </w:r>
+    </w:p>
+    <w:p>
+      <w:pPr>
+        <w:pStyle w:val="Compact"/>
+        <w:numPr>
+          <w:ilvl w:val="0"/>
+          <w:numId w:val="1004"/>
+        </w:numPr>
+      </w:pPr>
+      <w:r>
+        <w:rPr>
+          <w:b/>
+          <w:bCs/>
+        </w:rPr>
+        <w:t xml:space="preserve">Book 16</w:t>
+      </w:r>
+      <w:r>
+        <w:t xml:space="preserve"> </w:t>
+      </w:r>
+      <w:r>
+        <w:t xml:space="preserve">— Program Management and Governance (POA&amp;M/SCRM/ISPP)</w:t>
+      </w:r>
+    </w:p>
+    <w:p>
+      <w:pPr>
+        <w:pStyle w:val="Compact"/>
+        <w:numPr>
+          <w:ilvl w:val="0"/>
+          <w:numId w:val="1004"/>
+        </w:numPr>
+      </w:pPr>
+      <w:r>
+        <w:rPr>
+          <w:b/>
+          <w:bCs/>
+        </w:rPr>
+        <w:t xml:space="preserve">Book 17</w:t>
+      </w:r>
+      <w:r>
+        <w:t xml:space="preserve"> </w:t>
+      </w:r>
+      <w:r>
+        <w:t xml:space="preserve">— PII Processing and Transparency (PT family templates, Purview enforcement)</w:t>
+      </w:r>
+    </w:p>
+    <w:p>
+      <w:pPr>
+        <w:pStyle w:val="FirstParagraph"/>
+      </w:pPr>
+      <w:r>
+        <w:rPr>
+          <w:b/>
+          <w:bCs/>
+        </w:rPr>
+        <w:t xml:space="preserve">Book 18 — Training and Awareness</w:t>
+      </w:r>
+      <w:r>
+        <w:t xml:space="preserve"> </w:t>
+      </w:r>
+      <w:r>
+        <w:t xml:space="preserve">— AT family cybersecurity training program — activates KSI-022 (KSI-CED-RAT), making all 29 FedRAMP 20x CR26 KSIs evaluable at high confidence.</w:t>
+      </w:r>
+    </w:p>
+    <w:p>
+      <w:pPr>
+        <w:pStyle w:val="BodyText"/>
+      </w:pPr>
+      <w:r>
+        <w:rPr>
+          <w:b/>
+          <w:bCs/>
+        </w:rPr>
+        <w:t xml:space="preserve">Book 19 — Authorization Package and ConMon</w:t>
+      </w:r>
+      <w:r>
+        <w:t xml:space="preserve"> </w:t>
+      </w:r>
+      <w:r>
+        <w:t xml:space="preserve">— OSCAL AP+AR+POA&amp;M bundle (29/29 KSIs self-assessed, pending 3PAO validation), continuous monitoring program, and BOD 26-04 VDR/VER submission — closing CA-2, CA-5, CA-6, CA-7, RA-3, and SA-15.</w:t>
+      </w:r>
+    </w:p>
+    <w:p>
+      <w:pPr>
+        <w:pStyle w:val="BodyText"/>
+      </w:pPr>
+      <w:r>
+        <w:t xml:space="preserve">Together the series constitutes the complete evidence-generation and authorization layer required for FedRAMP 20x continuous monitoring authorization.</w:t>
       </w:r>
     </w:p>
     <w:p>
@@ -2496,7 +2964,7 @@
               <w:pStyle w:val="Compact"/>
               <w:numPr>
                 <w:ilvl w:val="0"/>
-                <w:numId w:val="1001"/>
+                <w:numId w:val="1005"/>
               </w:numPr>
             </w:pPr>
             <w:r>
@@ -2530,7 +2998,7 @@
               <w:pStyle w:val="Compact"/>
               <w:numPr>
                 <w:ilvl w:val="0"/>
-                <w:numId w:val="1001"/>
+                <w:numId w:val="1005"/>
               </w:numPr>
             </w:pPr>
             <w:r>
@@ -2570,7 +3038,7 @@
               <w:pStyle w:val="Compact"/>
               <w:numPr>
                 <w:ilvl w:val="0"/>
-                <w:numId w:val="1001"/>
+                <w:numId w:val="1005"/>
               </w:numPr>
             </w:pPr>
             <w:r>
@@ -3089,7 +3557,7 @@
         <w:pStyle w:val="Compact"/>
         <w:numPr>
           <w:ilvl w:val="0"/>
-          <w:numId w:val="1002"/>
+          <w:numId w:val="1006"/>
         </w:numPr>
       </w:pPr>
       <w:r>
@@ -3123,7 +3591,7 @@
         <w:pStyle w:val="Compact"/>
         <w:numPr>
           <w:ilvl w:val="0"/>
-          <w:numId w:val="1002"/>
+          <w:numId w:val="1006"/>
         </w:numPr>
       </w:pPr>
       <w:r>
@@ -3181,7 +3649,7 @@
         <w:pStyle w:val="Compact"/>
         <w:numPr>
           <w:ilvl w:val="0"/>
-          <w:numId w:val="1002"/>
+          <w:numId w:val="1006"/>
         </w:numPr>
       </w:pPr>
       <w:r>
@@ -3221,7 +3689,7 @@
         <w:pStyle w:val="Compact"/>
         <w:numPr>
           <w:ilvl w:val="0"/>
-          <w:numId w:val="1002"/>
+          <w:numId w:val="1006"/>
         </w:numPr>
       </w:pPr>
       <w:r>
@@ -3725,7 +4193,7 @@
         <w:pStyle w:val="Compact"/>
         <w:numPr>
           <w:ilvl w:val="0"/>
-          <w:numId w:val="1003"/>
+          <w:numId w:val="1007"/>
         </w:numPr>
       </w:pPr>
       <w:r>
@@ -3747,7 +4215,7 @@
         <w:pStyle w:val="Compact"/>
         <w:numPr>
           <w:ilvl w:val="0"/>
-          <w:numId w:val="1003"/>
+          <w:numId w:val="1007"/>
         </w:numPr>
       </w:pPr>
       <w:r>
@@ -3769,7 +4237,7 @@
         <w:pStyle w:val="Compact"/>
         <w:numPr>
           <w:ilvl w:val="0"/>
-          <w:numId w:val="1003"/>
+          <w:numId w:val="1007"/>
         </w:numPr>
       </w:pPr>
       <w:r>
@@ -3791,7 +4259,7 @@
         <w:pStyle w:val="Compact"/>
         <w:numPr>
           <w:ilvl w:val="0"/>
-          <w:numId w:val="1003"/>
+          <w:numId w:val="1007"/>
         </w:numPr>
       </w:pPr>
       <w:r>
@@ -3813,7 +4281,7 @@
         <w:pStyle w:val="Compact"/>
         <w:numPr>
           <w:ilvl w:val="0"/>
-          <w:numId w:val="1003"/>
+          <w:numId w:val="1007"/>
         </w:numPr>
       </w:pPr>
       <w:r>
@@ -3835,7 +4303,7 @@
         <w:pStyle w:val="Compact"/>
         <w:numPr>
           <w:ilvl w:val="0"/>
-          <w:numId w:val="1003"/>
+          <w:numId w:val="1007"/>
         </w:numPr>
       </w:pPr>
       <w:r>
@@ -3857,7 +4325,7 @@
         <w:pStyle w:val="Compact"/>
         <w:numPr>
           <w:ilvl w:val="0"/>
-          <w:numId w:val="1003"/>
+          <w:numId w:val="1007"/>
         </w:numPr>
       </w:pPr>
       <w:r>
@@ -3949,7 +4417,7 @@
         <w:pStyle w:val="Compact"/>
         <w:numPr>
           <w:ilvl w:val="0"/>
-          <w:numId w:val="1004"/>
+          <w:numId w:val="1008"/>
         </w:numPr>
       </w:pPr>
       <w:r>
@@ -3983,7 +4451,7 @@
         <w:pStyle w:val="Compact"/>
         <w:numPr>
           <w:ilvl w:val="0"/>
-          <w:numId w:val="1004"/>
+          <w:numId w:val="1008"/>
         </w:numPr>
       </w:pPr>
       <w:r>
@@ -4011,7 +4479,7 @@
         <w:pStyle w:val="Compact"/>
         <w:numPr>
           <w:ilvl w:val="0"/>
-          <w:numId w:val="1004"/>
+          <w:numId w:val="1008"/>
         </w:numPr>
       </w:pPr>
       <w:r>
@@ -4039,7 +4507,7 @@
         <w:pStyle w:val="Compact"/>
         <w:numPr>
           <w:ilvl w:val="0"/>
-          <w:numId w:val="1004"/>
+          <w:numId w:val="1008"/>
         </w:numPr>
       </w:pPr>
       <w:r>
@@ -4133,7 +4601,7 @@
         <w:pStyle w:val="Compact"/>
         <w:numPr>
           <w:ilvl w:val="0"/>
-          <w:numId w:val="1005"/>
+          <w:numId w:val="1009"/>
         </w:numPr>
       </w:pPr>
       <w:r>
@@ -4201,7 +4669,7 @@
         <w:pStyle w:val="Compact"/>
         <w:numPr>
           <w:ilvl w:val="0"/>
-          <w:numId w:val="1005"/>
+          <w:numId w:val="1009"/>
         </w:numPr>
       </w:pPr>
       <w:r>
@@ -7411,55 +7879,131 @@
         <w:t xml:space="preserve"> </w:t>
       </w:r>
       <w:r>
-        <w:t xml:space="preserve">is requesting. Part 2 closes that assumption:</w:t>
-      </w:r>
-      <w:r>
-        <w:t xml:space="preserve"> </w:t>
-      </w:r>
-      <w:r>
-        <w:t xml:space="preserve">802.1X EAP-TLS port authentication, RADIUS with real-time change of</w:t>
-      </w:r>
-      <w:r>
-        <w:t xml:space="preserve"> </w:t>
-      </w:r>
-      <w:r>
-        <w:t xml:space="preserve">authorization, certificate enrollment via Intune SCEP to TPM-backed machine</w:t>
-      </w:r>
-      <w:r>
-        <w:t xml:space="preserve"> </w:t>
-      </w:r>
-      <w:r>
-        <w:t xml:space="preserve">certificates, NAC policy tiers (production, remediation, quarantine, guest,</w:t>
-      </w:r>
-      <w:r>
-        <w:t xml:space="preserve"> </w:t>
-      </w:r>
-      <w:r>
-        <w:t xml:space="preserve">IoT), and DHCP fingerprinting that feeds IPAM as the authoritative device</w:t>
-      </w:r>
-      <w:r>
-        <w:t xml:space="preserve"> </w:t>
-      </w:r>
-      <w:r>
-        <w:t xml:space="preserve">inventory. The book opens with the Voice VLAN precedent — DHCP option-based</w:t>
-      </w:r>
-      <w:r>
-        <w:t xml:space="preserve"> </w:t>
-      </w:r>
-      <w:r>
-        <w:t xml:space="preserve">device steering as the earliest production proto-NAC — and closes with the</w:t>
-      </w:r>
-      <w:r>
-        <w:t xml:space="preserve"> </w:t>
-      </w:r>
-      <w:r>
-        <w:t xml:space="preserve">NAC → ZTNA continuum: posture asserted at the port evolving into posture</w:t>
-      </w:r>
-      <w:r>
-        <w:t xml:space="preserve"> </w:t>
-      </w:r>
-      <w:r>
-        <w:t xml:space="preserve">asserted in the token (Part 3).</w:t>
+        <w:t xml:space="preserve">is requesting. Part 2 closes that assumption</w:t>
+      </w:r>
+      <w:r>
+        <w:t xml:space="preserve"> </w:t>
+      </w:r>
+      <w:r>
+        <w:t xml:space="preserve">with five interlocking mechanisms:</w:t>
+      </w:r>
+    </w:p>
+    <w:p>
+      <w:pPr>
+        <w:pStyle w:val="Compact"/>
+        <w:numPr>
+          <w:ilvl w:val="0"/>
+          <w:numId w:val="1010"/>
+        </w:numPr>
+      </w:pPr>
+      <w:r>
+        <w:rPr>
+          <w:b/>
+          <w:bCs/>
+        </w:rPr>
+        <w:t xml:space="preserve">802.1X EAP-TLS</w:t>
+      </w:r>
+      <w:r>
+        <w:t xml:space="preserve"> </w:t>
+      </w:r>
+      <w:r>
+        <w:t xml:space="preserve">— port authentication with TPM-backed machine certificates issued via Intune SCEP</w:t>
+      </w:r>
+    </w:p>
+    <w:p>
+      <w:pPr>
+        <w:pStyle w:val="Compact"/>
+        <w:numPr>
+          <w:ilvl w:val="0"/>
+          <w:numId w:val="1010"/>
+        </w:numPr>
+      </w:pPr>
+      <w:r>
+        <w:rPr>
+          <w:b/>
+          <w:bCs/>
+        </w:rPr>
+        <w:t xml:space="preserve">RADIUS with Change of Authorization (CoA)</w:t>
+      </w:r>
+      <w:r>
+        <w:t xml:space="preserve"> </w:t>
+      </w:r>
+      <w:r>
+        <w:t xml:space="preserve">— real-time policy enforcement; non-compliant devices moved to the remediation VLAN without requiring re-authentication</w:t>
+      </w:r>
+    </w:p>
+    <w:p>
+      <w:pPr>
+        <w:pStyle w:val="Compact"/>
+        <w:numPr>
+          <w:ilvl w:val="0"/>
+          <w:numId w:val="1010"/>
+        </w:numPr>
+      </w:pPr>
+      <w:r>
+        <w:rPr>
+          <w:b/>
+          <w:bCs/>
+        </w:rPr>
+        <w:t xml:space="preserve">NAC policy tiers</w:t>
+      </w:r>
+      <w:r>
+        <w:t xml:space="preserve"> </w:t>
+      </w:r>
+      <w:r>
+        <w:t xml:space="preserve">— production, remediation, quarantine, guest, and IoT lanes with distinct access rights</w:t>
+      </w:r>
+    </w:p>
+    <w:p>
+      <w:pPr>
+        <w:pStyle w:val="Compact"/>
+        <w:numPr>
+          <w:ilvl w:val="0"/>
+          <w:numId w:val="1010"/>
+        </w:numPr>
+      </w:pPr>
+      <w:r>
+        <w:rPr>
+          <w:b/>
+          <w:bCs/>
+        </w:rPr>
+        <w:t xml:space="preserve">DHCP fingerprinting</w:t>
+      </w:r>
+      <w:r>
+        <w:t xml:space="preserve"> </w:t>
+      </w:r>
+      <w:r>
+        <w:t xml:space="preserve">— device classification feeding IPAM as the authoritative device inventory</w:t>
+      </w:r>
+    </w:p>
+    <w:p>
+      <w:pPr>
+        <w:pStyle w:val="Compact"/>
+        <w:numPr>
+          <w:ilvl w:val="0"/>
+          <w:numId w:val="1010"/>
+        </w:numPr>
+      </w:pPr>
+      <w:r>
+        <w:rPr>
+          <w:b/>
+          <w:bCs/>
+        </w:rPr>
+        <w:t xml:space="preserve">NAC → ZTNA continuum</w:t>
+      </w:r>
+      <w:r>
+        <w:t xml:space="preserve"> </w:t>
+      </w:r>
+      <w:r>
+        <w:t xml:space="preserve">— posture asserted at the port evolves into posture asserted in the token (Part 3)</w:t>
+      </w:r>
+    </w:p>
+    <w:p>
+      <w:pPr>
+        <w:pStyle w:val="FirstParagraph"/>
+      </w:pPr>
+      <w:r>
+        <w:t xml:space="preserve">The book opens with the Voice VLAN precedent — DHCP option-based device steering as the earliest production proto-NAC — to ground the architecture in operational history before extending to the full EAP-TLS model.</w:t>
       </w:r>
     </w:p>
     <w:p>
@@ -7547,37 +8091,103 @@
         <w:t xml:space="preserve"> </w:t>
       </w:r>
       <w:r>
-        <w:t xml:space="preserve">it — PKI as a naming-plane function (issuance, revocation, CAA, and ACME</w:t>
-      </w:r>
-      <w:r>
-        <w:t xml:space="preserve"> </w:t>
-      </w:r>
-      <w:r>
-        <w:t xml:space="preserve">DNS-01 live in the same substrate as Part 1’s DDI), certificate lifecycle</w:t>
-      </w:r>
-      <w:r>
-        <w:t xml:space="preserve"> </w:t>
-      </w:r>
-      <w:r>
-        <w:t xml:space="preserve">automation with short-lived certificates, token-based identity (OAuth</w:t>
-      </w:r>
-      <w:r>
-        <w:t xml:space="preserve"> </w:t>
-      </w:r>
-      <w:r>
-        <w:t xml:space="preserve">2.0/OIDC, certificate-based authentication, phishing-resistant MFA per BOD</w:t>
-      </w:r>
-      <w:r>
-        <w:t xml:space="preserve"> </w:t>
-      </w:r>
-      <w:r>
-        <w:t xml:space="preserve">25-01), and machine/workload identity. Parts 7–8’s SQL Server authentication</w:t>
-      </w:r>
-      <w:r>
-        <w:t xml:space="preserve"> </w:t>
-      </w:r>
-      <w:r>
-        <w:t xml:space="preserve">modernization is an application of this book’s doctrine to the database tier.</w:t>
+        <w:t xml:space="preserve">it:</w:t>
+      </w:r>
+    </w:p>
+    <w:p>
+      <w:pPr>
+        <w:pStyle w:val="Compact"/>
+        <w:numPr>
+          <w:ilvl w:val="0"/>
+          <w:numId w:val="1011"/>
+        </w:numPr>
+      </w:pPr>
+      <w:r>
+        <w:rPr>
+          <w:b/>
+          <w:bCs/>
+        </w:rPr>
+        <w:t xml:space="preserve">PKI as a naming-plane function</w:t>
+      </w:r>
+      <w:r>
+        <w:t xml:space="preserve"> </w:t>
+      </w:r>
+      <w:r>
+        <w:t xml:space="preserve">— certificate issuance, revocation, CAA, and ACME DNS-01 live in the same substrate as Part 1’s DDI</w:t>
+      </w:r>
+    </w:p>
+    <w:p>
+      <w:pPr>
+        <w:pStyle w:val="Compact"/>
+        <w:numPr>
+          <w:ilvl w:val="0"/>
+          <w:numId w:val="1011"/>
+        </w:numPr>
+      </w:pPr>
+      <w:r>
+        <w:rPr>
+          <w:b/>
+          <w:bCs/>
+        </w:rPr>
+        <w:t xml:space="preserve">Certificate lifecycle automation</w:t>
+      </w:r>
+      <w:r>
+        <w:t xml:space="preserve"> </w:t>
+      </w:r>
+      <w:r>
+        <w:t xml:space="preserve">— short-lived certificates with automated ACME renewal; expiry linked to IP host records</w:t>
+      </w:r>
+    </w:p>
+    <w:p>
+      <w:pPr>
+        <w:pStyle w:val="Compact"/>
+        <w:numPr>
+          <w:ilvl w:val="0"/>
+          <w:numId w:val="1011"/>
+        </w:numPr>
+      </w:pPr>
+      <w:r>
+        <w:rPr>
+          <w:b/>
+          <w:bCs/>
+        </w:rPr>
+        <w:t xml:space="preserve">Token-based identity</w:t>
+      </w:r>
+      <w:r>
+        <w:t xml:space="preserve"> </w:t>
+      </w:r>
+      <w:r>
+        <w:t xml:space="preserve">— OAuth 2.0/OIDC, certificate-based authentication (CBA), and phishing-resistant MFA per BOD 25-01</w:t>
+      </w:r>
+    </w:p>
+    <w:p>
+      <w:pPr>
+        <w:pStyle w:val="Compact"/>
+        <w:numPr>
+          <w:ilvl w:val="0"/>
+          <w:numId w:val="1011"/>
+        </w:numPr>
+      </w:pPr>
+      <w:r>
+        <w:rPr>
+          <w:b/>
+          <w:bCs/>
+        </w:rPr>
+        <w:t xml:space="preserve">Machine and workload identity</w:t>
+      </w:r>
+      <w:r>
+        <w:t xml:space="preserve"> </w:t>
+      </w:r>
+      <w:r>
+        <w:t xml:space="preserve">— managed identity for non-human principals that cannot hold passwords</w:t>
+      </w:r>
+    </w:p>
+    <w:p>
+      <w:pPr>
+        <w:pStyle w:val="FirstParagraph"/>
+      </w:pPr>
+      <w:r>
+        <w:t xml:space="preserve">Parts 7–8’s SQL Server authentication modernization is a direct application of this book’s cryptographic identity doctrine to the database tier.</w:t>
       </w:r>
     </w:p>
     <w:p>
@@ -7653,66 +8263,106 @@
         <w:t xml:space="preserve"> </w:t>
       </w:r>
       <w:r>
-        <w:t xml:space="preserve">the system that makes those assertions true — the SaaS-delivered HR system of</w:t>
-      </w:r>
-      <w:r>
-        <w:t xml:space="preserve"> </w:t>
-      </w:r>
-      <w:r>
-        <w:t xml:space="preserve">record (Oracle HCM Cloud) as the authoritative source for worker identity and</w:t>
-      </w:r>
-      <w:r>
-        <w:t xml:space="preserve"> </w:t>
-      </w:r>
-      <w:r>
-        <w:t xml:space="preserve">organizational structure. It covers the joiner/mover/leaver lifecycle driven by</w:t>
-      </w:r>
-      <w:r>
-        <w:t xml:space="preserve"> </w:t>
-      </w:r>
-      <w:r>
-        <w:t xml:space="preserve">HR events, HR-driven provisioning into Entra ID, identifier management, and the</w:t>
-      </w:r>
-      <w:r>
-        <w:t xml:space="preserve"> </w:t>
-      </w:r>
-      <w:r>
-        <w:t xml:space="preserve">organizational SSOT: supervisory hierarchy, positions, and cost centers as</w:t>
-      </w:r>
-      <w:r>
-        <w:t xml:space="preserve"> </w:t>
-      </w:r>
-      <w:r>
-        <w:t xml:space="preserve">queryable records that derive dynamic groups and access packages instead of</w:t>
-      </w:r>
-      <w:r>
-        <w:t xml:space="preserve"> </w:t>
-      </w:r>
-      <w:r>
-        <w:t xml:space="preserve">living in OU trees and drawings. Its integration surface — federation, SCIM</w:t>
-      </w:r>
-      <w:r>
-        <w:t xml:space="preserve"> </w:t>
-      </w:r>
-      <w:r>
-        <w:t xml:space="preserve">provisioning, DNS, and evidence export — is an identity-plane and naming-plane</w:t>
-      </w:r>
-      <w:r>
-        <w:t xml:space="preserve"> </w:t>
-      </w:r>
-      <w:r>
-        <w:t xml:space="preserve">surface, which is why it belongs to the substrate and not to any</w:t>
-      </w:r>
-      <w:r>
-        <w:t xml:space="preserve"> </w:t>
-      </w:r>
-      <w:r>
-        <w:t xml:space="preserve">infrastructure-hosting track.</w:t>
-      </w:r>
-    </w:p>
-    <w:p>
-      <w:pPr>
-        <w:pStyle w:val="BodyText"/>
+        <w:t xml:space="preserve">the system that makes those assertions true — Oracle HCM Cloud as the</w:t>
+      </w:r>
+      <w:r>
+        <w:t xml:space="preserve"> </w:t>
+      </w:r>
+      <w:r>
+        <w:t xml:space="preserve">authoritative source for worker identity and organizational structure:</w:t>
+      </w:r>
+    </w:p>
+    <w:p>
+      <w:pPr>
+        <w:pStyle w:val="Compact"/>
+        <w:numPr>
+          <w:ilvl w:val="0"/>
+          <w:numId w:val="1012"/>
+        </w:numPr>
+      </w:pPr>
+      <w:r>
+        <w:rPr>
+          <w:b/>
+          <w:bCs/>
+        </w:rPr>
+        <w:t xml:space="preserve">Joiner/mover/leaver lifecycle</w:t>
+      </w:r>
+      <w:r>
+        <w:t xml:space="preserve"> </w:t>
+      </w:r>
+      <w:r>
+        <w:t xml:space="preserve">— HR events drive same-day account creation, role change, and deprovisioning into Entra ID via SCIM</w:t>
+      </w:r>
+    </w:p>
+    <w:p>
+      <w:pPr>
+        <w:pStyle w:val="Compact"/>
+        <w:numPr>
+          <w:ilvl w:val="0"/>
+          <w:numId w:val="1012"/>
+        </w:numPr>
+      </w:pPr>
+      <w:r>
+        <w:rPr>
+          <w:b/>
+          <w:bCs/>
+        </w:rPr>
+        <w:t xml:space="preserve">Organizational SSOT</w:t>
+      </w:r>
+      <w:r>
+        <w:t xml:space="preserve"> </w:t>
+      </w:r>
+      <w:r>
+        <w:t xml:space="preserve">— supervisory hierarchy, positions, and cost centers as queryable records that derive dynamic groups and access packages instead of living in OU trees and static drawings</w:t>
+      </w:r>
+    </w:p>
+    <w:p>
+      <w:pPr>
+        <w:pStyle w:val="Compact"/>
+        <w:numPr>
+          <w:ilvl w:val="0"/>
+          <w:numId w:val="1012"/>
+        </w:numPr>
+      </w:pPr>
+      <w:r>
+        <w:rPr>
+          <w:b/>
+          <w:bCs/>
+        </w:rPr>
+        <w:t xml:space="preserve">Identifier management</w:t>
+      </w:r>
+      <w:r>
+        <w:t xml:space="preserve"> </w:t>
+      </w:r>
+      <w:r>
+        <w:t xml:space="preserve">— canonical identifiers anchored to the HR record flow through all downstream systems</w:t>
+      </w:r>
+    </w:p>
+    <w:p>
+      <w:pPr>
+        <w:pStyle w:val="Compact"/>
+        <w:numPr>
+          <w:ilvl w:val="0"/>
+          <w:numId w:val="1012"/>
+        </w:numPr>
+      </w:pPr>
+      <w:r>
+        <w:rPr>
+          <w:b/>
+          <w:bCs/>
+        </w:rPr>
+        <w:t xml:space="preserve">Identity-plane and naming-plane integration</w:t>
+      </w:r>
+      <w:r>
+        <w:t xml:space="preserve"> </w:t>
+      </w:r>
+      <w:r>
+        <w:t xml:space="preserve">— federation, SCIM provisioning, DNS, and evidence export make this a substrate function, not a hosting-track function</w:t>
+      </w:r>
+    </w:p>
+    <w:p>
+      <w:pPr>
+        <w:pStyle w:val="FirstParagraph"/>
       </w:pPr>
       <w:r>
         <w:rPr>
@@ -7812,7 +8462,7 @@
         <w:pStyle w:val="Compact"/>
         <w:numPr>
           <w:ilvl w:val="0"/>
-          <w:numId w:val="1006"/>
+          <w:numId w:val="1013"/>
         </w:numPr>
       </w:pPr>
       <w:r>
@@ -7834,7 +8484,7 @@
         <w:pStyle w:val="Compact"/>
         <w:numPr>
           <w:ilvl w:val="0"/>
-          <w:numId w:val="1006"/>
+          <w:numId w:val="1013"/>
         </w:numPr>
       </w:pPr>
       <w:r>
@@ -7856,7 +8506,7 @@
         <w:pStyle w:val="Compact"/>
         <w:numPr>
           <w:ilvl w:val="0"/>
-          <w:numId w:val="1006"/>
+          <w:numId w:val="1013"/>
         </w:numPr>
       </w:pPr>
       <w:r>
@@ -7878,7 +8528,7 @@
         <w:pStyle w:val="Compact"/>
         <w:numPr>
           <w:ilvl w:val="0"/>
-          <w:numId w:val="1006"/>
+          <w:numId w:val="1013"/>
         </w:numPr>
       </w:pPr>
       <w:r>
@@ -13778,7 +14428,7 @@
         <w:pStyle w:val="Compact"/>
         <w:numPr>
           <w:ilvl w:val="0"/>
-          <w:numId w:val="1007"/>
+          <w:numId w:val="1014"/>
         </w:numPr>
       </w:pPr>
       <w:r>
@@ -13806,7 +14456,7 @@
         <w:pStyle w:val="Compact"/>
         <w:numPr>
           <w:ilvl w:val="0"/>
-          <w:numId w:val="1007"/>
+          <w:numId w:val="1014"/>
         </w:numPr>
       </w:pPr>
       <w:r>
@@ -13834,7 +14484,7 @@
         <w:pStyle w:val="Compact"/>
         <w:numPr>
           <w:ilvl w:val="0"/>
-          <w:numId w:val="1007"/>
+          <w:numId w:val="1014"/>
         </w:numPr>
       </w:pPr>
       <w:r>
@@ -13862,7 +14512,7 @@
         <w:pStyle w:val="Compact"/>
         <w:numPr>
           <w:ilvl w:val="0"/>
-          <w:numId w:val="1007"/>
+          <w:numId w:val="1014"/>
         </w:numPr>
       </w:pPr>
       <w:r>
@@ -13898,7 +14548,7 @@
         <w:pStyle w:val="Compact"/>
         <w:numPr>
           <w:ilvl w:val="0"/>
-          <w:numId w:val="1008"/>
+          <w:numId w:val="1015"/>
         </w:numPr>
       </w:pPr>
       <w:r>
@@ -13920,7 +14570,7 @@
         <w:pStyle w:val="Compact"/>
         <w:numPr>
           <w:ilvl w:val="0"/>
-          <w:numId w:val="1008"/>
+          <w:numId w:val="1015"/>
         </w:numPr>
       </w:pPr>
       <w:r>
@@ -13942,7 +14592,7 @@
         <w:pStyle w:val="Compact"/>
         <w:numPr>
           <w:ilvl w:val="0"/>
-          <w:numId w:val="1008"/>
+          <w:numId w:val="1015"/>
         </w:numPr>
       </w:pPr>
       <w:r>
@@ -13964,7 +14614,7 @@
         <w:pStyle w:val="Compact"/>
         <w:numPr>
           <w:ilvl w:val="0"/>
-          <w:numId w:val="1008"/>
+          <w:numId w:val="1015"/>
         </w:numPr>
       </w:pPr>
       <w:r>
@@ -13986,7 +14636,7 @@
         <w:pStyle w:val="Compact"/>
         <w:numPr>
           <w:ilvl w:val="0"/>
-          <w:numId w:val="1008"/>
+          <w:numId w:val="1015"/>
         </w:numPr>
       </w:pPr>
       <w:r>
@@ -15818,7 +16468,7 @@
               <w:pStyle w:val="Compact"/>
             </w:pPr>
             <w:r>
-              <w:t xml:space="preserve">BOD 26-04 VDR/VER submission (Dec 7); Authorization package filed; OSCAL AP+AR+POAM bundle (29/29 satisfied)</w:t>
+              <w:t xml:space="preserve">BOD 26-04 VDR/VER submission (Dec 7); Authorization package filed; OSCAL AP+AR+POAM bundle (29/29 self-assessed, pending 3PAO validation)</w:t>
             </w:r>
           </w:p>
         </w:tc>
@@ -16753,7 +17403,7 @@
               <w:pStyle w:val="Compact"/>
             </w:pPr>
             <w:r>
-              <w:t xml:space="preserve">Part 19: FedRAMP 20x authorization package structure, OSCAL AP+AR+POA&amp;M bundle (29/29 satisfied), CA-7 ConMon program, BOD 26-04 VDR/VER submission, AO checklist, day-of-submission procedure</w:t>
+              <w:t xml:space="preserve">Part 19: FedRAMP 20x authorization package structure, OSCAL AP+AR+POA&amp;M bundle (29/29 self-assessed, pending 3PAO validation), CA-7 ConMon program, BOD 26-04 VDR/VER submission, AO checklist, day-of-submission procedure</w:t>
             </w:r>
           </w:p>
         </w:tc>
@@ -17038,6 +17688,109 @@
       </w:pPr>
     </w:lvl>
   </w:abstractNum>
+  <w:abstractNum w:abstractNumId="991">
+    <w:nsid w:val="0000A991"/>
+    <w:multiLevelType w:val="multilevel"/>
+    <w:lvl w:ilvl="0">
+      <w:numFmt w:val="bullet"/>
+      <w:lvlText w:val=""/>
+      <w:lvlJc w:val="left"/>
+      <w:pPr>
+        <w:ind w:left="720" w:hanging="360"/>
+      </w:pPr>
+      <w:rPr>
+        <w:rFonts w:ascii="Symbol" w:hAnsi="Symbol" w:cs="Symbol" w:hint="default"/>
+      </w:rPr>
+    </w:lvl>
+    <w:lvl w:ilvl="1">
+      <w:numFmt w:val="bullet"/>
+      <w:lvlText w:val="o"/>
+      <w:lvlJc w:val="left"/>
+      <w:pPr>
+        <w:ind w:left="1440" w:hanging="360"/>
+      </w:pPr>
+      <w:rPr>
+        <w:rFonts w:ascii="Courier New" w:hAnsi="Courier New" w:cs="Courier New" w:hint="default"/>
+      </w:rPr>
+    </w:lvl>
+    <w:lvl w:ilvl="2">
+      <w:numFmt w:val="bullet"/>
+      <w:lvlText w:val=""/>
+      <w:lvlJc w:val="left"/>
+      <w:pPr>
+        <w:ind w:left="2160" w:hanging="360"/>
+      </w:pPr>
+      <w:rPr>
+        <w:rFonts w:ascii="Wingdings" w:hAnsi="Wingdings" w:cs="Wingdings" w:hint="default"/>
+      </w:rPr>
+    </w:lvl>
+    <w:lvl w:ilvl="3">
+      <w:numFmt w:val="bullet"/>
+      <w:lvlText w:val=""/>
+      <w:lvlJc w:val="left"/>
+      <w:pPr>
+        <w:ind w:left="2880" w:hanging="360"/>
+      </w:pPr>
+      <w:rPr>
+        <w:rFonts w:ascii="Symbol" w:hAnsi="Symbol" w:cs="Symbol" w:hint="default"/>
+      </w:rPr>
+    </w:lvl>
+    <w:lvl w:ilvl="4">
+      <w:numFmt w:val="bullet"/>
+      <w:lvlText w:val="o"/>
+      <w:lvlJc w:val="left"/>
+      <w:pPr>
+        <w:ind w:left="3600" w:hanging="360"/>
+      </w:pPr>
+      <w:rPr>
+        <w:rFonts w:ascii="Courier New" w:hAnsi="Courier New" w:cs="Courier New" w:hint="default"/>
+      </w:rPr>
+    </w:lvl>
+    <w:lvl w:ilvl="5">
+      <w:numFmt w:val="bullet"/>
+      <w:lvlText w:val=""/>
+      <w:lvlJc w:val="left"/>
+      <w:pPr>
+        <w:ind w:left="4320" w:hanging="360"/>
+      </w:pPr>
+      <w:rPr>
+        <w:rFonts w:ascii="Wingdings" w:hAnsi="Wingdings" w:cs="Wingdings" w:hint="default"/>
+      </w:rPr>
+    </w:lvl>
+    <w:lvl w:ilvl="6">
+      <w:numFmt w:val="bullet"/>
+      <w:lvlText w:val=""/>
+      <w:lvlJc w:val="left"/>
+      <w:pPr>
+        <w:ind w:left="5040" w:hanging="360"/>
+      </w:pPr>
+      <w:rPr>
+        <w:rFonts w:ascii="Symbol" w:hAnsi="Symbol" w:cs="Symbol" w:hint="default"/>
+      </w:rPr>
+    </w:lvl>
+    <w:lvl w:ilvl="7">
+      <w:numFmt w:val="bullet"/>
+      <w:lvlText w:val="o"/>
+      <w:lvlJc w:val="left"/>
+      <w:pPr>
+        <w:ind w:left="5760" w:hanging="360"/>
+      </w:pPr>
+      <w:rPr>
+        <w:rFonts w:ascii="Courier New" w:hAnsi="Courier New" w:cs="Courier New" w:hint="default"/>
+      </w:rPr>
+    </w:lvl>
+    <w:lvl w:ilvl="8">
+      <w:numFmt w:val="bullet"/>
+      <w:lvlText w:val=""/>
+      <w:lvlJc w:val="left"/>
+      <w:pPr>
+        <w:ind w:left="6480" w:hanging="360"/>
+      </w:pPr>
+      <w:rPr>
+        <w:rFonts w:ascii="Wingdings" w:hAnsi="Wingdings" w:cs="Wingdings" w:hint="default"/>
+      </w:rPr>
+    </w:lvl>
+  </w:abstractNum>
   <w:abstractNum w:abstractNumId="99411">
     <w:nsid w:val="00A99411"/>
     <w:multiLevelType w:val="multilevel"/>
@@ -17123,113 +17876,22 @@
       </w:pPr>
     </w:lvl>
   </w:abstractNum>
-  <w:abstractNum w:abstractNumId="991">
-    <w:nsid w:val="0000A991"/>
-    <w:multiLevelType w:val="multilevel"/>
-    <w:lvl w:ilvl="0">
-      <w:numFmt w:val="bullet"/>
-      <w:lvlText w:val=""/>
-      <w:lvlJc w:val="left"/>
-      <w:pPr>
-        <w:ind w:left="720" w:hanging="360"/>
-      </w:pPr>
-      <w:rPr>
-        <w:rFonts w:ascii="Symbol" w:hAnsi="Symbol" w:cs="Symbol" w:hint="default"/>
-      </w:rPr>
-    </w:lvl>
-    <w:lvl w:ilvl="1">
-      <w:numFmt w:val="bullet"/>
-      <w:lvlText w:val="o"/>
-      <w:lvlJc w:val="left"/>
-      <w:pPr>
-        <w:ind w:left="1440" w:hanging="360"/>
-      </w:pPr>
-      <w:rPr>
-        <w:rFonts w:ascii="Courier New" w:hAnsi="Courier New" w:cs="Courier New" w:hint="default"/>
-      </w:rPr>
-    </w:lvl>
-    <w:lvl w:ilvl="2">
-      <w:numFmt w:val="bullet"/>
-      <w:lvlText w:val=""/>
-      <w:lvlJc w:val="left"/>
-      <w:pPr>
-        <w:ind w:left="2160" w:hanging="360"/>
-      </w:pPr>
-      <w:rPr>
-        <w:rFonts w:ascii="Wingdings" w:hAnsi="Wingdings" w:cs="Wingdings" w:hint="default"/>
-      </w:rPr>
-    </w:lvl>
-    <w:lvl w:ilvl="3">
-      <w:numFmt w:val="bullet"/>
-      <w:lvlText w:val=""/>
-      <w:lvlJc w:val="left"/>
-      <w:pPr>
-        <w:ind w:left="2880" w:hanging="360"/>
-      </w:pPr>
-      <w:rPr>
-        <w:rFonts w:ascii="Symbol" w:hAnsi="Symbol" w:cs="Symbol" w:hint="default"/>
-      </w:rPr>
-    </w:lvl>
-    <w:lvl w:ilvl="4">
-      <w:numFmt w:val="bullet"/>
-      <w:lvlText w:val="o"/>
-      <w:lvlJc w:val="left"/>
-      <w:pPr>
-        <w:ind w:left="3600" w:hanging="360"/>
-      </w:pPr>
-      <w:rPr>
-        <w:rFonts w:ascii="Courier New" w:hAnsi="Courier New" w:cs="Courier New" w:hint="default"/>
-      </w:rPr>
-    </w:lvl>
-    <w:lvl w:ilvl="5">
-      <w:numFmt w:val="bullet"/>
-      <w:lvlText w:val=""/>
-      <w:lvlJc w:val="left"/>
-      <w:pPr>
-        <w:ind w:left="4320" w:hanging="360"/>
-      </w:pPr>
-      <w:rPr>
-        <w:rFonts w:ascii="Wingdings" w:hAnsi="Wingdings" w:cs="Wingdings" w:hint="default"/>
-      </w:rPr>
-    </w:lvl>
-    <w:lvl w:ilvl="6">
-      <w:numFmt w:val="bullet"/>
-      <w:lvlText w:val=""/>
-      <w:lvlJc w:val="left"/>
-      <w:pPr>
-        <w:ind w:left="5040" w:hanging="360"/>
-      </w:pPr>
-      <w:rPr>
-        <w:rFonts w:ascii="Symbol" w:hAnsi="Symbol" w:cs="Symbol" w:hint="default"/>
-      </w:rPr>
-    </w:lvl>
-    <w:lvl w:ilvl="7">
-      <w:numFmt w:val="bullet"/>
-      <w:lvlText w:val="o"/>
-      <w:lvlJc w:val="left"/>
-      <w:pPr>
-        <w:ind w:left="5760" w:hanging="360"/>
-      </w:pPr>
-      <w:rPr>
-        <w:rFonts w:ascii="Courier New" w:hAnsi="Courier New" w:cs="Courier New" w:hint="default"/>
-      </w:rPr>
-    </w:lvl>
-    <w:lvl w:ilvl="8">
-      <w:numFmt w:val="bullet"/>
-      <w:lvlText w:val=""/>
-      <w:lvlJc w:val="left"/>
-      <w:pPr>
-        <w:ind w:left="6480" w:hanging="360"/>
-      </w:pPr>
-      <w:rPr>
-        <w:rFonts w:ascii="Wingdings" w:hAnsi="Wingdings" w:cs="Wingdings" w:hint="default"/>
-      </w:rPr>
-    </w:lvl>
-  </w:abstractNum>
   <w:num w:numId="1000">
     <w:abstractNumId w:val="990"/>
   </w:num>
   <w:num w:numId="1001">
+    <w:abstractNumId w:val="991"/>
+  </w:num>
+  <w:num w:numId="1002">
+    <w:abstractNumId w:val="991"/>
+  </w:num>
+  <w:num w:numId="1003">
+    <w:abstractNumId w:val="991"/>
+  </w:num>
+  <w:num w:numId="1004">
+    <w:abstractNumId w:val="991"/>
+  </w:num>
+  <w:num w:numId="1005">
     <w:abstractNumId w:val="99411"/>
     <w:lvlOverride w:ilvl="0">
       <w:startOverride w:val="1"/>
@@ -17259,19 +17921,28 @@
       <w:startOverride w:val="1"/>
     </w:lvlOverride>
   </w:num>
-  <w:num w:numId="1002">
+  <w:num w:numId="1006">
     <w:abstractNumId w:val="991"/>
   </w:num>
-  <w:num w:numId="1003">
+  <w:num w:numId="1007">
     <w:abstractNumId w:val="991"/>
   </w:num>
-  <w:num w:numId="1004">
+  <w:num w:numId="1008">
     <w:abstractNumId w:val="991"/>
   </w:num>
-  <w:num w:numId="1005">
+  <w:num w:numId="1009">
     <w:abstractNumId w:val="991"/>
   </w:num>
-  <w:num w:numId="1006">
+  <w:num w:numId="1010">
+    <w:abstractNumId w:val="991"/>
+  </w:num>
+  <w:num w:numId="1011">
+    <w:abstractNumId w:val="991"/>
+  </w:num>
+  <w:num w:numId="1012">
+    <w:abstractNumId w:val="991"/>
+  </w:num>
+  <w:num w:numId="1013">
     <w:abstractNumId w:val="99411"/>
     <w:lvlOverride w:ilvl="0">
       <w:startOverride w:val="1"/>
@@ -17301,7 +17972,7 @@
       <w:startOverride w:val="1"/>
     </w:lvlOverride>
   </w:num>
-  <w:num w:numId="1007">
+  <w:num w:numId="1014">
     <w:abstractNumId w:val="99411"/>
     <w:lvlOverride w:ilvl="0">
       <w:startOverride w:val="1"/>
@@ -17331,7 +18002,7 @@
       <w:startOverride w:val="1"/>
     </w:lvlOverride>
   </w:num>
-  <w:num w:numId="1008">
+  <w:num w:numId="1015">
     <w:abstractNumId w:val="991"/>
   </w:num>
 </w:numbering>

</xml_diff>

<commit_message>
feat(inbox/aan): Book 00 spec compliance — deck vendor sources + figure write-back
Brings the separately-built Book 00 briefing deck into line with the
series authoring spec, and runs the spec section 4 image write-back:
- deck: Vendor sources lines added to the 14 slide notes lacking them
  (FedRAMP 20x, NIST 800-53, ITU-T G.114, CISA TIC/SCuBA, Secure Score,
  repo-path citations for internal claims); Date Code bumped to
  2026-07-07 09:58 ET across title banner and all 21 footers
- write-back (4 augments, no existing counterparts): es-fig-05 six
  functional planes, es-fig-06 DIA three-step argument, es-fig-07
  architecture-before-assessment chevrons, es-fig-08 coverage
  arithmetic 10-of-29; deck slides 4/18/21 dispositioned skip (existing
  es-fig-01/02/04 cover the same concepts)
- Book Date Code 2026-07-07 09:58 ET (frontmatter + draft callout);
  docx and html re-rendered from qmd

Co-Authored-By: Claude Fable 5 <noreply@anthropic.com>
</commit_message>
<xml_diff>
--- a/inbox/Application Aware Networking/Book_00_FedAAN_Executive_Summary.docx
+++ b/inbox/Application Aware Networking/Book_00_FedAAN_Executive_Summary.docx
@@ -31,7 +31,7 @@
         <w:pStyle w:val="Date"/>
       </w:pPr>
       <w:r>
-        <w:t xml:space="preserve">2026-07-01</w:t>
+        <w:t xml:space="preserve">Invalid Date</w:t>
       </w:r>
     </w:p>
     <w:sdt>
@@ -114,7 +114,7 @@
                     <a:graphicData uri="http://schemas.openxmlformats.org/drawingml/2006/picture">
                       <pic:pic>
                         <pic:nvPicPr>
-                          <pic:cNvPr descr="/opt/quarto/share/formats/docx/warning.png" id="11" name="Picture"/>
+                          <pic:cNvPr descr="C:\Program Files\Quarto\share\formats\docx\warning.png" id="11" name="Picture"/>
                           <pic:cNvPicPr>
                             <a:picLocks noChangeArrowheads="1" noChangeAspect="1"/>
                           </pic:cNvPicPr>
@@ -174,7 +174,7 @@
               <w:pStyle w:val="BodyText"/>
             </w:pPr>
             <w:pPr>
-              <w:spacing w:before="16" w:after="16"/>
+              <w:spacing w:before="16"/>
             </w:pPr>
             <w:r>
               <w:t xml:space="preserve">This document is a</w:t>
@@ -207,6 +207,27 @@
             </w:r>
             <w:r>
               <w:t xml:space="preserve">. It is an attempt at a comprehensive SSA-wide technical roadmap and has not been reviewed or approved by the SSA CIO Office, the Office of Information Security (OIS), or organizational leadership. All recommendations, vendor selections, control mappings, and implementation timelines are subject to revision pending formal review by the SSA CIO Office and organizational components.</w:t>
+            </w:r>
+          </w:p>
+          <w:p>
+            <w:pPr>
+              <w:pStyle w:val="BodyText"/>
+            </w:pPr>
+            <w:pPr>
+              <w:spacing w:after="16"/>
+            </w:pPr>
+            <w:r>
+              <w:rPr>
+                <w:b/>
+                <w:bCs/>
+              </w:rPr>
+              <w:t xml:space="preserve">Date Code:</w:t>
+            </w:r>
+            <w:r>
+              <w:t xml:space="preserve"> </w:t>
+            </w:r>
+            <w:r>
+              <w:t xml:space="preserve">2026-07-07 09:58 ET</w:t>
             </w:r>
           </w:p>
           <w:p/>
@@ -2373,7 +2394,7 @@
       </w:r>
     </w:p>
     <w:bookmarkEnd w:id="17"/>
-    <w:bookmarkStart w:id="18" w:name="the-functional-plane-model"/>
+    <w:bookmarkStart w:id="21" w:name="the-functional-plane-model"/>
     <w:p>
       <w:pPr>
         <w:pStyle w:val="Heading1"/>
@@ -2425,6 +2446,61 @@
       </w:r>
       <w:r>
         <w:t xml:space="preserve">without the model taking a position on whose structure is correct.</w:t>
+      </w:r>
+    </w:p>
+    <w:p>
+      <w:pPr>
+        <w:pStyle w:val="CaptionedFigure"/>
+      </w:pPr>
+      <w:r>
+        <w:drawing>
+          <wp:inline>
+            <wp:extent cx="5334000" cy="3000375"/>
+            <wp:effectExtent b="0" l="0" r="0" t="0"/>
+            <wp:docPr descr="The Six Functional Planes — functions, not organizations" title="" id="19" name="Picture"/>
+            <a:graphic>
+              <a:graphicData uri="http://schemas.openxmlformats.org/drawingml/2006/picture">
+                <pic:pic>
+                  <pic:nvPicPr>
+                    <pic:cNvPr descr="figs/es-fig-05-functional-planes.png" id="20" name="Picture"/>
+                    <pic:cNvPicPr>
+                      <a:picLocks noChangeArrowheads="1" noChangeAspect="1"/>
+                    </pic:cNvPicPr>
+                  </pic:nvPicPr>
+                  <pic:blipFill>
+                    <a:blip r:embed="rId18"/>
+                    <a:stretch>
+                      <a:fillRect/>
+                    </a:stretch>
+                  </pic:blipFill>
+                  <pic:spPr bwMode="auto">
+                    <a:xfrm>
+                      <a:off x="0" y="0"/>
+                      <a:ext cx="5334000" cy="3000375"/>
+                    </a:xfrm>
+                    <a:prstGeom prst="rect">
+                      <a:avLst/>
+                    </a:prstGeom>
+                    <a:noFill/>
+                    <a:ln w="9525">
+                      <a:noFill/>
+                      <a:headEnd/>
+                      <a:tailEnd/>
+                    </a:ln>
+                  </pic:spPr>
+                </pic:pic>
+              </a:graphicData>
+            </a:graphic>
+          </wp:inline>
+        </w:drawing>
+      </w:r>
+    </w:p>
+    <w:p>
+      <w:pPr>
+        <w:pStyle w:val="ImageCaption"/>
+      </w:pPr>
+      <w:r>
+        <w:t xml:space="preserve">The Six Functional Planes — functions, not organizations</w:t>
       </w:r>
     </w:p>
     <w:p>
@@ -2938,8 +3014,8 @@
         <w:t xml:space="preserve">authority lives; the enforcement planes are where its will is done.</w:t>
       </w:r>
     </w:p>
-    <w:bookmarkEnd w:id="18"/>
-    <w:bookmarkStart w:id="22" w:name="the-closure-necessity-doctrine"/>
+    <w:bookmarkEnd w:id="21"/>
+    <w:bookmarkStart w:id="28" w:name="the-closure-necessity-doctrine"/>
     <w:p>
       <w:pPr>
         <w:pStyle w:val="Heading1"/>
@@ -3290,18 +3366,18 @@
                 <wp:inline>
                   <wp:extent cx="152400" cy="152400"/>
                   <wp:effectExtent b="0" l="0" r="0" t="0"/>
-                  <wp:docPr descr="" title="" id="20" name="Picture"/>
+                  <wp:docPr descr="" title="" id="23" name="Picture"/>
                   <a:graphic>
                     <a:graphicData uri="http://schemas.openxmlformats.org/drawingml/2006/picture">
                       <pic:pic>
                         <pic:nvPicPr>
-                          <pic:cNvPr descr="/opt/quarto/share/formats/docx/important.png" id="21" name="Picture"/>
+                          <pic:cNvPr descr="C:\Program Files\Quarto\share\formats\docx\important.png" id="24" name="Picture"/>
                           <pic:cNvPicPr>
                             <a:picLocks noChangeArrowheads="1" noChangeAspect="1"/>
                           </pic:cNvPicPr>
                         </pic:nvPicPr>
                         <pic:blipFill>
-                          <a:blip r:embed="rId19"/>
+                          <a:blip r:embed="rId22"/>
                           <a:stretch>
                             <a:fillRect/>
                           </a:stretch>
@@ -3352,6 +3428,61 @@
           </w:tcPr>
           <w:p>
             <w:pPr>
+              <w:pStyle w:val="CaptionedFigure"/>
+            </w:pPr>
+            <w:r>
+              <w:drawing>
+                <wp:inline>
+                  <wp:extent cx="5334000" cy="3000375"/>
+                  <wp:effectExtent b="0" l="0" r="0" t="0"/>
+                  <wp:docPr descr="DIA Is a Pipe — the governance stack satisfies the controls, the pipe solves latency" title="" id="26" name="Picture"/>
+                  <a:graphic>
+                    <a:graphicData uri="http://schemas.openxmlformats.org/drawingml/2006/picture">
+                      <pic:pic>
+                        <pic:nvPicPr>
+                          <pic:cNvPr descr="figs/es-fig-06-dia-three-step.png" id="27" name="Picture"/>
+                          <pic:cNvPicPr>
+                            <a:picLocks noChangeArrowheads="1" noChangeAspect="1"/>
+                          </pic:cNvPicPr>
+                        </pic:nvPicPr>
+                        <pic:blipFill>
+                          <a:blip r:embed="rId25"/>
+                          <a:stretch>
+                            <a:fillRect/>
+                          </a:stretch>
+                        </pic:blipFill>
+                        <pic:spPr bwMode="auto">
+                          <a:xfrm>
+                            <a:off x="0" y="0"/>
+                            <a:ext cx="5334000" cy="3000375"/>
+                          </a:xfrm>
+                          <a:prstGeom prst="rect">
+                            <a:avLst/>
+                          </a:prstGeom>
+                          <a:noFill/>
+                          <a:ln w="9525">
+                            <a:noFill/>
+                            <a:headEnd/>
+                            <a:tailEnd/>
+                          </a:ln>
+                        </pic:spPr>
+                      </pic:pic>
+                    </a:graphicData>
+                  </a:graphic>
+                </wp:inline>
+              </w:drawing>
+            </w:r>
+          </w:p>
+          <w:p>
+            <w:pPr>
+              <w:pStyle w:val="ImageCaption"/>
+            </w:pPr>
+            <w:r>
+              <w:t xml:space="preserve">DIA Is a Pipe — the governance stack satisfies the controls, the pipe solves latency</w:t>
+            </w:r>
+          </w:p>
+          <w:p>
+            <w:pPr>
               <w:pStyle w:val="Compact"/>
               <w:numPr>
                 <w:ilvl w:val="0"/>
@@ -3490,8 +3621,8 @@
         </w:tc>
       </w:tr>
     </w:tbl>
-    <w:bookmarkEnd w:id="22"/>
-    <w:bookmarkStart w:id="23" w:name="Xf8de29cfeb422b4472c7c7d92bb03b44a5c864b"/>
+    <w:bookmarkEnd w:id="28"/>
+    <w:bookmarkStart w:id="29" w:name="Xf8de29cfeb422b4472c7c7d92bb03b44a5c864b"/>
     <w:p>
       <w:pPr>
         <w:pStyle w:val="Heading1"/>
@@ -3831,8 +3962,8 @@
         </w:pict>
       </w:r>
     </w:p>
-    <w:bookmarkEnd w:id="23"/>
-    <w:bookmarkStart w:id="32" w:name="X61a7a87a6a804b656956b0680aba9e198648b99"/>
+    <w:bookmarkEnd w:id="29"/>
+    <w:bookmarkStart w:id="44" w:name="X61a7a87a6a804b656956b0680aba9e198648b99"/>
     <w:p>
       <w:pPr>
         <w:pStyle w:val="Heading1"/>
@@ -3873,7 +4004,7 @@
         <w:t xml:space="preserve">architectural work is done.</w:t>
       </w:r>
     </w:p>
-    <w:bookmarkStart w:id="24" w:name="what-assessment-tools-actually-do"/>
+    <w:bookmarkStart w:id="30" w:name="what-assessment-tools-actually-do"/>
     <w:p>
       <w:pPr>
         <w:pStyle w:val="Heading2"/>
@@ -4147,8 +4278,8 @@
         <w:t xml:space="preserve">your cardiovascular system.</w:t>
       </w:r>
     </w:p>
-    <w:bookmarkEnd w:id="24"/>
-    <w:bookmarkStart w:id="25" w:name="the-correct-sequencing"/>
+    <w:bookmarkEnd w:id="30"/>
+    <w:bookmarkStart w:id="34" w:name="the-correct-sequencing"/>
     <w:p>
       <w:pPr>
         <w:pStyle w:val="Heading2"/>
@@ -4187,6 +4318,61 @@
       </w:r>
       <w:r>
         <w:t xml:space="preserve">that do not accumulate into a defensible, integrated compliance posture.</w:t>
+      </w:r>
+    </w:p>
+    <w:p>
+      <w:pPr>
+        <w:pStyle w:val="CaptionedFigure"/>
+      </w:pPr>
+      <w:r>
+        <w:drawing>
+          <wp:inline>
+            <wp:extent cx="5334000" cy="3000375"/>
+            <wp:effectExtent b="0" l="0" r="0" t="0"/>
+            <wp:docPr descr="Architecture Before Assessment — six phases; assessment tools arrive at Phase 5" title="" id="32" name="Picture"/>
+            <a:graphic>
+              <a:graphicData uri="http://schemas.openxmlformats.org/drawingml/2006/picture">
+                <pic:pic>
+                  <pic:nvPicPr>
+                    <pic:cNvPr descr="figs/es-fig-07-architecture-before-assessment.png" id="33" name="Picture"/>
+                    <pic:cNvPicPr>
+                      <a:picLocks noChangeArrowheads="1" noChangeAspect="1"/>
+                    </pic:cNvPicPr>
+                  </pic:nvPicPr>
+                  <pic:blipFill>
+                    <a:blip r:embed="rId31"/>
+                    <a:stretch>
+                      <a:fillRect/>
+                    </a:stretch>
+                  </pic:blipFill>
+                  <pic:spPr bwMode="auto">
+                    <a:xfrm>
+                      <a:off x="0" y="0"/>
+                      <a:ext cx="5334000" cy="3000375"/>
+                    </a:xfrm>
+                    <a:prstGeom prst="rect">
+                      <a:avLst/>
+                    </a:prstGeom>
+                    <a:noFill/>
+                    <a:ln w="9525">
+                      <a:noFill/>
+                      <a:headEnd/>
+                      <a:tailEnd/>
+                    </a:ln>
+                  </pic:spPr>
+                </pic:pic>
+              </a:graphicData>
+            </a:graphic>
+          </wp:inline>
+        </w:drawing>
+      </w:r>
+    </w:p>
+    <w:p>
+      <w:pPr>
+        <w:pStyle w:val="ImageCaption"/>
+      </w:pPr>
+      <w:r>
+        <w:t xml:space="preserve">Architecture Before Assessment — six phases; assessment tools arrive at Phase 5</w:t>
       </w:r>
     </w:p>
     <w:p>
@@ -4529,8 +4715,8 @@
         <w:t xml:space="preserve">run. The assessment tool confirms what the architecture already guarantees.</w:t>
       </w:r>
     </w:p>
-    <w:bookmarkEnd w:id="25"/>
-    <w:bookmarkStart w:id="29" w:name="Xbeccda7f0395df87220c304250d30fffcfba132"/>
+    <w:bookmarkEnd w:id="34"/>
+    <w:bookmarkStart w:id="38" w:name="Xbeccda7f0395df87220c304250d30fffcfba132"/>
     <w:p>
       <w:pPr>
         <w:pStyle w:val="Heading2"/>
@@ -4606,18 +4792,18 @@
                 <wp:inline>
                   <wp:extent cx="152400" cy="152400"/>
                   <wp:effectExtent b="0" l="0" r="0" t="0"/>
-                  <wp:docPr descr="" title="" id="27" name="Picture"/>
+                  <wp:docPr descr="" title="" id="36" name="Picture"/>
                   <a:graphic>
                     <a:graphicData uri="http://schemas.openxmlformats.org/drawingml/2006/picture">
                       <pic:pic>
                         <pic:nvPicPr>
-                          <pic:cNvPr descr="/opt/quarto/share/formats/docx/note.png" id="28" name="Picture"/>
+                          <pic:cNvPr descr="C:\Program Files\Quarto\share\formats\docx\note.png" id="37" name="Picture"/>
                           <pic:cNvPicPr>
                             <a:picLocks noChangeArrowheads="1" noChangeAspect="1"/>
                           </pic:cNvPicPr>
                         </pic:nvPicPr>
                         <pic:blipFill>
-                          <a:blip r:embed="rId26"/>
+                          <a:blip r:embed="rId35"/>
                           <a:stretch>
                             <a:fillRect/>
                           </a:stretch>
@@ -4921,8 +5107,8 @@
         <w:t xml:space="preserve">surface and left the rest unmeasured and undefended.</w:t>
       </w:r>
     </w:p>
-    <w:bookmarkEnd w:id="29"/>
-    <w:bookmarkStart w:id="30" w:name="the-role-of-this-series"/>
+    <w:bookmarkEnd w:id="38"/>
+    <w:bookmarkStart w:id="39" w:name="the-role-of-this-series"/>
     <w:p>
       <w:pPr>
         <w:pStyle w:val="Heading2"/>
@@ -5099,8 +5285,8 @@
         <w:t xml:space="preserve">the final proof, not the starting point.</w:t>
       </w:r>
     </w:p>
-    <w:bookmarkEnd w:id="30"/>
-    <w:bookmarkStart w:id="31" w:name="the-coverage-arithmetic-10-of-29"/>
+    <w:bookmarkEnd w:id="39"/>
+    <w:bookmarkStart w:id="43" w:name="the-coverage-arithmetic-10-of-29"/>
     <w:p>
       <w:pPr>
         <w:pStyle w:val="Heading2"/>
@@ -5127,6 +5313,61 @@
       </w:r>
       <w:r>
         <w:t xml:space="preserve">evaluation engine:</w:t>
+      </w:r>
+    </w:p>
+    <w:p>
+      <w:pPr>
+        <w:pStyle w:val="CaptionedFigure"/>
+      </w:pPr>
+      <w:r>
+        <w:drawing>
+          <wp:inline>
+            <wp:extent cx="5334000" cy="3000375"/>
+            <wp:effectExtent b="0" l="0" r="0" t="0"/>
+            <wp:docPr descr="The Coverage Arithmetic — 10 of 29 KSI rules attestable by conformance tooling alone" title="" id="41" name="Picture"/>
+            <a:graphic>
+              <a:graphicData uri="http://schemas.openxmlformats.org/drawingml/2006/picture">
+                <pic:pic>
+                  <pic:nvPicPr>
+                    <pic:cNvPr descr="figs/es-fig-08-coverage-arithmetic.png" id="42" name="Picture"/>
+                    <pic:cNvPicPr>
+                      <a:picLocks noChangeArrowheads="1" noChangeAspect="1"/>
+                    </pic:cNvPicPr>
+                  </pic:nvPicPr>
+                  <pic:blipFill>
+                    <a:blip r:embed="rId40"/>
+                    <a:stretch>
+                      <a:fillRect/>
+                    </a:stretch>
+                  </pic:blipFill>
+                  <pic:spPr bwMode="auto">
+                    <a:xfrm>
+                      <a:off x="0" y="0"/>
+                      <a:ext cx="5334000" cy="3000375"/>
+                    </a:xfrm>
+                    <a:prstGeom prst="rect">
+                      <a:avLst/>
+                    </a:prstGeom>
+                    <a:noFill/>
+                    <a:ln w="9525">
+                      <a:noFill/>
+                      <a:headEnd/>
+                      <a:tailEnd/>
+                    </a:ln>
+                  </pic:spPr>
+                </pic:pic>
+              </a:graphicData>
+            </a:graphic>
+          </wp:inline>
+        </w:drawing>
+      </w:r>
+    </w:p>
+    <w:p>
+      <w:pPr>
+        <w:pStyle w:val="ImageCaption"/>
+      </w:pPr>
+      <w:r>
+        <w:t xml:space="preserve">The Coverage Arithmetic — 10 of 29 KSI rules attestable by conformance tooling alone</w:t>
       </w:r>
     </w:p>
     <w:p>
@@ -5326,9 +5567,9 @@
         </w:pict>
       </w:r>
     </w:p>
-    <w:bookmarkEnd w:id="31"/>
-    <w:bookmarkEnd w:id="32"/>
-    <w:bookmarkStart w:id="33" w:name="the-ksi-closure-necessity-matrix"/>
+    <w:bookmarkEnd w:id="43"/>
+    <w:bookmarkEnd w:id="44"/>
+    <w:bookmarkStart w:id="45" w:name="the-ksi-closure-necessity-matrix"/>
     <w:p>
       <w:pPr>
         <w:pStyle w:val="Heading1"/>
@@ -5954,8 +6195,8 @@
         </w:pict>
       </w:r>
     </w:p>
-    <w:bookmarkEnd w:id="33"/>
-    <w:bookmarkStart w:id="36" w:name="Xd8412075ae72a1334f7aea052d8fa68fa2dbbc2"/>
+    <w:bookmarkEnd w:id="45"/>
+    <w:bookmarkStart w:id="48" w:name="Xd8412075ae72a1334f7aea052d8fa68fa2dbbc2"/>
     <w:p>
       <w:pPr>
         <w:pStyle w:val="Heading1"/>
@@ -6751,18 +6992,18 @@
                 <wp:inline>
                   <wp:extent cx="152400" cy="152400"/>
                   <wp:effectExtent b="0" l="0" r="0" t="0"/>
-                  <wp:docPr descr="" title="" id="34" name="Picture"/>
+                  <wp:docPr descr="" title="" id="46" name="Picture"/>
                   <a:graphic>
                     <a:graphicData uri="http://schemas.openxmlformats.org/drawingml/2006/picture">
                       <pic:pic>
                         <pic:nvPicPr>
-                          <pic:cNvPr descr="/opt/quarto/share/formats/docx/note.png" id="35" name="Picture"/>
+                          <pic:cNvPr descr="C:\Program Files\Quarto\share\formats\docx\note.png" id="47" name="Picture"/>
                           <pic:cNvPicPr>
                             <a:picLocks noChangeArrowheads="1" noChangeAspect="1"/>
                           </pic:cNvPicPr>
                         </pic:nvPicPr>
                         <pic:blipFill>
-                          <a:blip r:embed="rId26"/>
+                          <a:blip r:embed="rId35"/>
                           <a:stretch>
                             <a:fillRect/>
                           </a:stretch>
@@ -6843,8 +7084,8 @@
         </w:pict>
       </w:r>
     </w:p>
-    <w:bookmarkEnd w:id="36"/>
-    <w:bookmarkStart w:id="39" w:name="X6f9a64b586cbcc7969c4f245976846e0504a959"/>
+    <w:bookmarkEnd w:id="48"/>
+    <w:bookmarkStart w:id="51" w:name="X6f9a64b586cbcc7969c4f245976846e0504a959"/>
     <w:p>
       <w:pPr>
         <w:pStyle w:val="Heading1"/>
@@ -6853,7 +7094,7 @@
         <w:t xml:space="preserve">7. Part 1 — Landing Zone DDI: InfoBlox DDI Closes 16 NIST Controls</w:t>
       </w:r>
     </w:p>
-    <w:bookmarkStart w:id="37" w:name="what-this-document-addresses"/>
+    <w:bookmarkStart w:id="49" w:name="what-this-document-addresses"/>
     <w:p>
       <w:pPr>
         <w:pStyle w:val="Heading2"/>
@@ -6904,8 +7145,8 @@
         <w:t xml:space="preserve">that would otherwise require manual evidence assembly from four separate sources.</w:t>
       </w:r>
     </w:p>
-    <w:bookmarkEnd w:id="37"/>
-    <w:bookmarkStart w:id="38" w:name="nist-control-closure-part-1"/>
+    <w:bookmarkEnd w:id="49"/>
+    <w:bookmarkStart w:id="50" w:name="nist-control-closure-part-1"/>
     <w:p>
       <w:pPr>
         <w:pStyle w:val="Heading2"/>
@@ -8349,9 +8590,9 @@
         </w:pict>
       </w:r>
     </w:p>
-    <w:bookmarkEnd w:id="38"/>
-    <w:bookmarkEnd w:id="39"/>
-    <w:bookmarkStart w:id="41" w:name="Xbcc0181b0bedc83b159769420775f7f4bd5b5ee"/>
+    <w:bookmarkEnd w:id="50"/>
+    <w:bookmarkEnd w:id="51"/>
+    <w:bookmarkStart w:id="53" w:name="Xbcc0181b0bedc83b159769420775f7f4bd5b5ee"/>
     <w:p>
       <w:pPr>
         <w:pStyle w:val="Heading1"/>
@@ -8360,7 +8601,7 @@
         <w:t xml:space="preserve">8. Part 2 — Network Access Control: 802.1X Closes the Device Identity Gap</w:t>
       </w:r>
     </w:p>
-    <w:bookmarkStart w:id="40" w:name="what-this-document-addresses-1"/>
+    <w:bookmarkStart w:id="52" w:name="what-this-document-addresses-1"/>
     <w:p>
       <w:pPr>
         <w:pStyle w:val="Heading2"/>
@@ -8581,9 +8822,9 @@
         <w:t xml:space="preserve">and 5.</w:t>
       </w:r>
     </w:p>
-    <w:bookmarkEnd w:id="40"/>
-    <w:bookmarkEnd w:id="41"/>
-    <w:bookmarkStart w:id="43" w:name="X405ac1b7341efa237459fac366bded0a1afb81b"/>
+    <w:bookmarkEnd w:id="52"/>
+    <w:bookmarkEnd w:id="53"/>
+    <w:bookmarkStart w:id="55" w:name="X405ac1b7341efa237459fac366bded0a1afb81b"/>
     <w:p>
       <w:pPr>
         <w:pStyle w:val="Heading1"/>
@@ -8592,7 +8833,7 @@
         <w:t xml:space="preserve">9. Part 3 — Certificates &amp; Tokens: Cryptographic Identity</w:t>
       </w:r>
     </w:p>
-    <w:bookmarkStart w:id="42" w:name="what-this-document-addresses-2"/>
+    <w:bookmarkStart w:id="54" w:name="what-this-document-addresses-2"/>
     <w:p>
       <w:pPr>
         <w:pStyle w:val="Heading2"/>
@@ -8753,9 +8994,9 @@
         <w:t xml:space="preserve">and Parts 7–8 database closures stand.</w:t>
       </w:r>
     </w:p>
-    <w:bookmarkEnd w:id="42"/>
-    <w:bookmarkEnd w:id="43"/>
-    <w:bookmarkStart w:id="45" w:name="Xc99982daf1675290c6dee7e65da8f2f47fccda2"/>
+    <w:bookmarkEnd w:id="54"/>
+    <w:bookmarkEnd w:id="55"/>
+    <w:bookmarkStart w:id="57" w:name="Xc99982daf1675290c6dee7e65da8f2f47fccda2"/>
     <w:p>
       <w:pPr>
         <w:pStyle w:val="Heading1"/>
@@ -8764,7 +9005,7 @@
         <w:t xml:space="preserve">10. Part 4 — OPM HRIT and the Identity &amp; Organizational SSOT</w:t>
       </w:r>
     </w:p>
-    <w:bookmarkStart w:id="44" w:name="what-this-document-addresses-3"/>
+    <w:bookmarkStart w:id="56" w:name="what-this-document-addresses-3"/>
     <w:p>
       <w:pPr>
         <w:pStyle w:val="Heading2"/>
@@ -8954,9 +9195,9 @@
         </w:pict>
       </w:r>
     </w:p>
-    <w:bookmarkEnd w:id="44"/>
-    <w:bookmarkEnd w:id="45"/>
-    <w:bookmarkStart w:id="48" w:name="X10b5b70168cf61c697e46bca4109e68839cb391"/>
+    <w:bookmarkEnd w:id="56"/>
+    <w:bookmarkEnd w:id="57"/>
+    <w:bookmarkStart w:id="60" w:name="X10b5b70168cf61c697e46bca4109e68839cb391"/>
     <w:p>
       <w:pPr>
         <w:pStyle w:val="Heading1"/>
@@ -8965,7 +9206,7 @@
         <w:t xml:space="preserve">11. Part 5 — Network and Identity Modernization: Entra ID + ZTNA + Active Governance Closes 12 NIST Controls</w:t>
       </w:r>
     </w:p>
-    <w:bookmarkStart w:id="46" w:name="what-this-document-addresses-4"/>
+    <w:bookmarkStart w:id="58" w:name="what-this-document-addresses-4"/>
     <w:p>
       <w:pPr>
         <w:pStyle w:val="Heading2"/>
@@ -9078,8 +9319,8 @@
         <w:t xml:space="preserve">— a control plane that holds desired state, observes actual state, classifies drift, and reconciles toward intent while generating machine-readable evidence continuously</w:t>
       </w:r>
     </w:p>
-    <w:bookmarkEnd w:id="46"/>
-    <w:bookmarkStart w:id="47" w:name="nist-control-closure-part-5"/>
+    <w:bookmarkEnd w:id="58"/>
+    <w:bookmarkStart w:id="59" w:name="nist-control-closure-part-5"/>
     <w:p>
       <w:pPr>
         <w:pStyle w:val="Heading2"/>
@@ -10163,9 +10404,9 @@
         </w:pict>
       </w:r>
     </w:p>
-    <w:bookmarkEnd w:id="47"/>
-    <w:bookmarkEnd w:id="48"/>
-    <w:bookmarkStart w:id="51" w:name="X2d88030fe1371762303048ee6244da6478ed0f7"/>
+    <w:bookmarkEnd w:id="59"/>
+    <w:bookmarkEnd w:id="60"/>
+    <w:bookmarkStart w:id="63" w:name="X2d88030fe1371762303048ee6244da6478ed0f7"/>
     <w:p>
       <w:pPr>
         <w:pStyle w:val="Heading1"/>
@@ -10174,7 +10415,7 @@
         <w:t xml:space="preserve">12. Part 6 — Telecommunications Modernization: SD-WAN + SASE Closes 7 NIST Controls</w:t>
       </w:r>
     </w:p>
-    <w:bookmarkStart w:id="49" w:name="what-this-document-addresses-5"/>
+    <w:bookmarkStart w:id="61" w:name="what-this-document-addresses-5"/>
     <w:p>
       <w:pPr>
         <w:pStyle w:val="Heading2"/>
@@ -10279,8 +10520,8 @@
         <w:t xml:space="preserve">above.</w:t>
       </w:r>
     </w:p>
-    <w:bookmarkEnd w:id="49"/>
-    <w:bookmarkStart w:id="50" w:name="nist-control-closure-part-6"/>
+    <w:bookmarkEnd w:id="61"/>
+    <w:bookmarkStart w:id="62" w:name="nist-control-closure-part-6"/>
     <w:p>
       <w:pPr>
         <w:pStyle w:val="Heading2"/>
@@ -11166,9 +11407,9 @@
         </w:pict>
       </w:r>
     </w:p>
-    <w:bookmarkEnd w:id="50"/>
-    <w:bookmarkEnd w:id="51"/>
-    <w:bookmarkStart w:id="55" w:name="Xd4e84a07e291e418566bcb97aa439fd3597f127"/>
+    <w:bookmarkEnd w:id="62"/>
+    <w:bookmarkEnd w:id="63"/>
+    <w:bookmarkStart w:id="67" w:name="Xd4e84a07e291e418566bcb97aa439fd3597f127"/>
     <w:p>
       <w:pPr>
         <w:pStyle w:val="Heading1"/>
@@ -11177,7 +11418,7 @@
         <w:t xml:space="preserve">13. Parts 7–9 — SQL Server and Database Architecture</w:t>
       </w:r>
     </w:p>
-    <w:bookmarkStart w:id="52" w:name="what-these-documents-address"/>
+    <w:bookmarkStart w:id="64" w:name="what-these-documents-address"/>
     <w:p>
       <w:pPr>
         <w:pStyle w:val="Heading2"/>
@@ -11248,8 +11489,8 @@
         <w:t xml:space="preserve">addresses the architectural substrate: logical vs. physical centralization, the speed-of-light propagation floor that constrains cross-region consistency, SD-WAN traffic class separation for database replication traffic, token-based security as a database consolidation enabler, and the consistency class to transport class alignment rule.</w:t>
       </w:r>
     </w:p>
-    <w:bookmarkEnd w:id="52"/>
-    <w:bookmarkStart w:id="53" w:name="Xc74b659e897be830e678314afc220cdcc22e191"/>
+    <w:bookmarkEnd w:id="64"/>
+    <w:bookmarkStart w:id="65" w:name="Xc74b659e897be830e678314afc220cdcc22e191"/>
     <w:p>
       <w:pPr>
         <w:pStyle w:val="Heading2"/>
@@ -12164,8 +12405,8 @@
         <w:t xml:space="preserve">IA-2, IA-3, IA-5, AC-2, AC-3, AC-17, AU-2/AU-12, CA-7, CM-2/CM-8, SC-8, SI-4 — all are deepened closures of controls addressed in Parts 1–6 at the identity and network layers, now extended to the database authentication layer.</w:t>
       </w:r>
     </w:p>
-    <w:bookmarkEnd w:id="53"/>
-    <w:bookmarkStart w:id="54" w:name="X49b810de19b49316cda83287164b25a1932c9dc"/>
+    <w:bookmarkEnd w:id="65"/>
+    <w:bookmarkStart w:id="66" w:name="X49b810de19b49316cda83287164b25a1932c9dc"/>
     <w:p>
       <w:pPr>
         <w:pStyle w:val="Heading2"/>
@@ -12897,9 +13138,9 @@
         </w:pict>
       </w:r>
     </w:p>
-    <w:bookmarkEnd w:id="54"/>
-    <w:bookmarkEnd w:id="55"/>
-    <w:bookmarkStart w:id="57" w:name="parts-1019-expanded-control-coverage"/>
+    <w:bookmarkEnd w:id="66"/>
+    <w:bookmarkEnd w:id="67"/>
+    <w:bookmarkStart w:id="69" w:name="parts-1019-expanded-control-coverage"/>
     <w:p>
       <w:pPr>
         <w:pStyle w:val="Heading1"/>
@@ -12941,7 +13182,7 @@
         <w:t xml:space="preserve">. Parts 15–17 close the three control families the network and security architecture documents cannot address on their own: supply chain risk management, program management governance, and PII processing transparency.</w:t>
       </w:r>
     </w:p>
-    <w:bookmarkStart w:id="56" w:name="nist-control-closure-parts-1019"/>
+    <w:bookmarkStart w:id="68" w:name="nist-control-closure-parts-1019"/>
     <w:p>
       <w:pPr>
         <w:pStyle w:val="Heading2"/>
@@ -13664,9 +13905,9 @@
         </w:pict>
       </w:r>
     </w:p>
-    <w:bookmarkEnd w:id="56"/>
-    <w:bookmarkEnd w:id="57"/>
-    <w:bookmarkStart w:id="64" w:name="combined-control-closure-summary"/>
+    <w:bookmarkEnd w:id="68"/>
+    <w:bookmarkEnd w:id="69"/>
+    <w:bookmarkStart w:id="76" w:name="combined-control-closure-summary"/>
     <w:p>
       <w:pPr>
         <w:pStyle w:val="Heading1"/>
@@ -13684,18 +13925,18 @@
           <wp:inline>
             <wp:extent cx="5334000" cy="2769576"/>
             <wp:effectExtent b="0" l="0" r="0" t="0"/>
-            <wp:docPr descr="NIST SP 800-53 Control Closure by Family and Track — Six Tracks (Parts 1 and 5–9)" title="" id="59" name="Picture"/>
+            <wp:docPr descr="NIST SP 800-53 Control Closure by Family and Track — Six Tracks (Parts 1 and 5–9)" title="" id="71" name="Picture"/>
             <a:graphic>
               <a:graphicData uri="http://schemas.openxmlformats.org/drawingml/2006/picture">
                 <pic:pic>
                   <pic:nvPicPr>
-                    <pic:cNvPr descr="figs/es-fig-02-control-closure-chart.png" id="60" name="Picture"/>
+                    <pic:cNvPr descr="figs/es-fig-02-control-closure-chart.png" id="72" name="Picture"/>
                     <pic:cNvPicPr>
                       <a:picLocks noChangeArrowheads="1" noChangeAspect="1"/>
                     </pic:cNvPicPr>
                   </pic:nvPicPr>
                   <pic:blipFill>
-                    <a:blip r:embed="rId58"/>
+                    <a:blip r:embed="rId70"/>
                     <a:stretch>
                       <a:fillRect/>
                     </a:stretch>
@@ -13730,7 +13971,7 @@
         <w:t xml:space="preserve">NIST SP 800-53 Control Closure by Family and Track — Six Tracks (Parts 1 and 5–9)</w:t>
       </w:r>
     </w:p>
-    <w:bookmarkStart w:id="61" w:name="X098d98be751efe7c6f37e3b7959bb12c4a66520"/>
+    <w:bookmarkStart w:id="73" w:name="X098d98be751efe7c6f37e3b7959bb12c4a66520"/>
     <w:p>
       <w:pPr>
         <w:pStyle w:val="Heading2"/>
@@ -14427,8 +14668,8 @@
         </w:tc>
       </w:tr>
     </w:tbl>
-    <w:bookmarkEnd w:id="61"/>
-    <w:bookmarkStart w:id="62" w:name="control-count-comparison"/>
+    <w:bookmarkEnd w:id="73"/>
+    <w:bookmarkStart w:id="74" w:name="control-count-comparison"/>
     <w:p>
       <w:pPr>
         <w:pStyle w:val="Heading2"/>
@@ -14901,8 +15142,8 @@
         <w:t xml:space="preserve">Several controls appear across multiple tracks (SC-7, SC-8, SC-20/21, AU-2/AU-12, CM-8, CA-7). Where multiple tracks address the same control at different layers (e.g., DNS-layer SC-7 in Part 1, network-layer SC-7 in Part 6, database-layer authentication in Parts 7–8), both implementations contribute. The 34 count is of distinct control numbers — the total implementation coverage across all layers of each control is broader.</w:t>
       </w:r>
     </w:p>
-    <w:bookmarkEnd w:id="62"/>
-    <w:bookmarkStart w:id="63" w:name="what-closed-means-under-fedramp-20x"/>
+    <w:bookmarkEnd w:id="74"/>
+    <w:bookmarkStart w:id="75" w:name="what-closed-means-under-fedramp-20x"/>
     <w:p>
       <w:pPr>
         <w:pStyle w:val="Heading2"/>
@@ -15217,9 +15458,9 @@
         </w:pict>
       </w:r>
     </w:p>
-    <w:bookmarkEnd w:id="63"/>
-    <w:bookmarkEnd w:id="64"/>
-    <w:bookmarkStart w:id="70" w:name="X1dcc5f970527785b00bea4121aa336894765923"/>
+    <w:bookmarkEnd w:id="75"/>
+    <w:bookmarkEnd w:id="76"/>
+    <w:bookmarkStart w:id="82" w:name="X1dcc5f970527785b00bea4121aa336894765923"/>
     <w:p>
       <w:pPr>
         <w:pStyle w:val="Heading1"/>
@@ -15248,7 +15489,7 @@
         <w:t xml:space="preserve">these gaps; the series is now complete across all identified control families.</w:t>
       </w:r>
     </w:p>
-    <w:bookmarkStart w:id="65" w:name="Xa81065e3c6a65dd344b5d14588b12711850ea25"/>
+    <w:bookmarkStart w:id="77" w:name="Xa81065e3c6a65dd344b5d14588b12711850ea25"/>
     <w:p>
       <w:pPr>
         <w:pStyle w:val="Heading2"/>
@@ -15338,8 +15579,8 @@
         <w:t xml:space="preserve">KSI-SCR-MON activated at high confidence.</w:t>
       </w:r>
     </w:p>
-    <w:bookmarkEnd w:id="65"/>
-    <w:bookmarkStart w:id="66" w:name="pm-program-management"/>
+    <w:bookmarkEnd w:id="77"/>
+    <w:bookmarkStart w:id="78" w:name="pm-program-management"/>
     <w:p>
       <w:pPr>
         <w:pStyle w:val="Heading2"/>
@@ -15410,8 +15651,8 @@
         <w:t xml:space="preserve">T&amp;T&amp;M plan. KSI-SCR governance closure at high confidence.</w:t>
       </w:r>
     </w:p>
-    <w:bookmarkEnd w:id="66"/>
-    <w:bookmarkStart w:id="67" w:name="pt-pii-processing-and-transparency"/>
+    <w:bookmarkEnd w:id="78"/>
+    <w:bookmarkStart w:id="79" w:name="pt-pii-processing-and-transparency"/>
     <w:p>
       <w:pPr>
         <w:pStyle w:val="Heading2"/>
@@ -15488,8 +15729,8 @@
         <w:t xml:space="preserve">at high confidence.</w:t>
       </w:r>
     </w:p>
-    <w:bookmarkEnd w:id="67"/>
-    <w:bookmarkStart w:id="68" w:name="X461ed25ed3923a3d8b55e0e3965ec2f4255b061"/>
+    <w:bookmarkEnd w:id="79"/>
+    <w:bookmarkStart w:id="80" w:name="X461ed25ed3923a3d8b55e0e3965ec2f4255b061"/>
     <w:p>
       <w:pPr>
         <w:pStyle w:val="Heading2"/>
@@ -15611,8 +15852,8 @@
         <w:t xml:space="preserve">All 29 CR26 KSIs are now evaluable.</w:t>
       </w:r>
     </w:p>
-    <w:bookmarkEnd w:id="68"/>
-    <w:bookmarkStart w:id="69" w:name="priority-4-cr26-breadth-gaps-resolved"/>
+    <w:bookmarkEnd w:id="80"/>
+    <w:bookmarkStart w:id="81" w:name="priority-4-cr26-breadth-gaps-resolved"/>
     <w:p>
       <w:pPr>
         <w:pStyle w:val="Heading2"/>
@@ -15666,9 +15907,9 @@
         </w:pict>
       </w:r>
     </w:p>
-    <w:bookmarkEnd w:id="69"/>
-    <w:bookmarkEnd w:id="70"/>
-    <w:bookmarkStart w:id="71" w:name="Xe8a0cfc3dacfc499165fbb6b52941ca764a0109"/>
+    <w:bookmarkEnd w:id="81"/>
+    <w:bookmarkEnd w:id="82"/>
+    <w:bookmarkStart w:id="83" w:name="Xe8a0cfc3dacfc499165fbb6b52941ca764a0109"/>
     <w:p>
       <w:pPr>
         <w:pStyle w:val="Heading1"/>
@@ -16114,8 +16355,8 @@
         </w:pict>
       </w:r>
     </w:p>
-    <w:bookmarkEnd w:id="71"/>
-    <w:bookmarkStart w:id="77" w:name="implementation-priority-and-sequencing"/>
+    <w:bookmarkEnd w:id="83"/>
+    <w:bookmarkStart w:id="89" w:name="implementation-priority-and-sequencing"/>
     <w:p>
       <w:pPr>
         <w:pStyle w:val="Heading1"/>
@@ -16133,18 +16374,18 @@
           <wp:inline>
             <wp:extent cx="5334000" cy="2051538"/>
             <wp:effectExtent b="0" l="0" r="0" t="0"/>
-            <wp:docPr descr="Implementation Sequencing — Path to FedRAMP 20x Mandatory Compliance by January 1 2027" title="" id="73" name="Picture"/>
+            <wp:docPr descr="Implementation Sequencing — Path to FedRAMP 20x Mandatory Compliance by January 1 2027" title="" id="85" name="Picture"/>
             <a:graphic>
               <a:graphicData uri="http://schemas.openxmlformats.org/drawingml/2006/picture">
                 <pic:pic>
                   <pic:nvPicPr>
-                    <pic:cNvPr descr="figs/es-fig-04-sequencing-roadmap.png" id="74" name="Picture"/>
+                    <pic:cNvPr descr="figs/es-fig-04-sequencing-roadmap.png" id="86" name="Picture"/>
                     <pic:cNvPicPr>
                       <a:picLocks noChangeArrowheads="1" noChangeAspect="1"/>
                     </pic:cNvPicPr>
                   </pic:nvPicPr>
                   <pic:blipFill>
-                    <a:blip r:embed="rId72"/>
+                    <a:blip r:embed="rId84"/>
                     <a:stretch>
                       <a:fillRect/>
                     </a:stretch>
@@ -16676,7 +16917,7 @@
         </w:pict>
       </w:r>
     </w:p>
-    <w:bookmarkStart w:id="75" w:name="phased-delivery-roadmap"/>
+    <w:bookmarkStart w:id="87" w:name="phased-delivery-roadmap"/>
     <w:p>
       <w:pPr>
         <w:pStyle w:val="Heading2"/>
@@ -17114,8 +17355,8 @@
         </w:pict>
       </w:r>
     </w:p>
-    <w:bookmarkEnd w:id="75"/>
-    <w:bookmarkStart w:id="76" w:name="technology-recommendations-by-gap"/>
+    <w:bookmarkEnd w:id="87"/>
+    <w:bookmarkStart w:id="88" w:name="technology-recommendations-by-gap"/>
     <w:p>
       <w:pPr>
         <w:pStyle w:val="Heading2"/>
@@ -17332,9 +17573,9 @@
         </w:pict>
       </w:r>
     </w:p>
-    <w:bookmarkEnd w:id="76"/>
-    <w:bookmarkEnd w:id="77"/>
-    <w:bookmarkStart w:id="97" w:name="document-references"/>
+    <w:bookmarkEnd w:id="88"/>
+    <w:bookmarkEnd w:id="89"/>
+    <w:bookmarkStart w:id="109" w:name="document-references"/>
     <w:p>
       <w:pPr>
         <w:pStyle w:val="Heading1"/>
@@ -17397,7 +17638,7 @@
             <w:pPr>
               <w:pStyle w:val="Compact"/>
             </w:pPr>
-            <w:hyperlink r:id="rId78">
+            <w:hyperlink r:id="rId90">
               <w:r>
                 <w:rPr>
                   <w:rStyle w:val="Hyperlink"/>
@@ -17426,7 +17667,7 @@
             <w:pPr>
               <w:pStyle w:val="Compact"/>
             </w:pPr>
-            <w:hyperlink r:id="rId79">
+            <w:hyperlink r:id="rId91">
               <w:r>
                 <w:rPr>
                   <w:rStyle w:val="Hyperlink"/>
@@ -17455,7 +17696,7 @@
             <w:pPr>
               <w:pStyle w:val="Compact"/>
             </w:pPr>
-            <w:hyperlink r:id="rId80">
+            <w:hyperlink r:id="rId92">
               <w:r>
                 <w:rPr>
                   <w:rStyle w:val="Hyperlink"/>
@@ -17484,7 +17725,7 @@
             <w:pPr>
               <w:pStyle w:val="Compact"/>
             </w:pPr>
-            <w:hyperlink r:id="rId81">
+            <w:hyperlink r:id="rId93">
               <w:r>
                 <w:rPr>
                   <w:rStyle w:val="Hyperlink"/>
@@ -17513,7 +17754,7 @@
             <w:pPr>
               <w:pStyle w:val="Compact"/>
             </w:pPr>
-            <w:hyperlink r:id="rId82">
+            <w:hyperlink r:id="rId94">
               <w:r>
                 <w:rPr>
                   <w:rStyle w:val="Hyperlink"/>
@@ -17542,7 +17783,7 @@
             <w:pPr>
               <w:pStyle w:val="Compact"/>
             </w:pPr>
-            <w:hyperlink r:id="rId83">
+            <w:hyperlink r:id="rId95">
               <w:r>
                 <w:rPr>
                   <w:rStyle w:val="Hyperlink"/>
@@ -17571,7 +17812,7 @@
             <w:pPr>
               <w:pStyle w:val="Compact"/>
             </w:pPr>
-            <w:hyperlink r:id="rId84">
+            <w:hyperlink r:id="rId96">
               <w:r>
                 <w:rPr>
                   <w:rStyle w:val="Hyperlink"/>
@@ -17600,7 +17841,7 @@
             <w:pPr>
               <w:pStyle w:val="Compact"/>
             </w:pPr>
-            <w:hyperlink r:id="rId85">
+            <w:hyperlink r:id="rId97">
               <w:r>
                 <w:rPr>
                   <w:rStyle w:val="Hyperlink"/>
@@ -17629,7 +17870,7 @@
             <w:pPr>
               <w:pStyle w:val="Compact"/>
             </w:pPr>
-            <w:hyperlink r:id="rId86">
+            <w:hyperlink r:id="rId98">
               <w:r>
                 <w:rPr>
                   <w:rStyle w:val="Hyperlink"/>
@@ -17658,7 +17899,7 @@
             <w:pPr>
               <w:pStyle w:val="Compact"/>
             </w:pPr>
-            <w:hyperlink r:id="rId87">
+            <w:hyperlink r:id="rId99">
               <w:r>
                 <w:rPr>
                   <w:rStyle w:val="Hyperlink"/>
@@ -17687,7 +17928,7 @@
             <w:pPr>
               <w:pStyle w:val="Compact"/>
             </w:pPr>
-            <w:hyperlink r:id="rId88">
+            <w:hyperlink r:id="rId100">
               <w:r>
                 <w:rPr>
                   <w:rStyle w:val="Hyperlink"/>
@@ -17716,7 +17957,7 @@
             <w:pPr>
               <w:pStyle w:val="Compact"/>
             </w:pPr>
-            <w:hyperlink r:id="rId89">
+            <w:hyperlink r:id="rId101">
               <w:r>
                 <w:rPr>
                   <w:rStyle w:val="Hyperlink"/>
@@ -17745,7 +17986,7 @@
             <w:pPr>
               <w:pStyle w:val="Compact"/>
             </w:pPr>
-            <w:hyperlink r:id="rId90">
+            <w:hyperlink r:id="rId102">
               <w:r>
                 <w:rPr>
                   <w:rStyle w:val="Hyperlink"/>
@@ -17774,7 +18015,7 @@
             <w:pPr>
               <w:pStyle w:val="Compact"/>
             </w:pPr>
-            <w:hyperlink r:id="rId91">
+            <w:hyperlink r:id="rId103">
               <w:r>
                 <w:rPr>
                   <w:rStyle w:val="Hyperlink"/>
@@ -17803,7 +18044,7 @@
             <w:pPr>
               <w:pStyle w:val="Compact"/>
             </w:pPr>
-            <w:hyperlink r:id="rId92">
+            <w:hyperlink r:id="rId104">
               <w:r>
                 <w:rPr>
                   <w:rStyle w:val="Hyperlink"/>
@@ -17832,7 +18073,7 @@
             <w:pPr>
               <w:pStyle w:val="Compact"/>
             </w:pPr>
-            <w:hyperlink r:id="rId93">
+            <w:hyperlink r:id="rId105">
               <w:r>
                 <w:rPr>
                   <w:rStyle w:val="Hyperlink"/>
@@ -17861,7 +18102,7 @@
             <w:pPr>
               <w:pStyle w:val="Compact"/>
             </w:pPr>
-            <w:hyperlink r:id="rId94">
+            <w:hyperlink r:id="rId106">
               <w:r>
                 <w:rPr>
                   <w:rStyle w:val="Hyperlink"/>
@@ -17890,7 +18131,7 @@
             <w:pPr>
               <w:pStyle w:val="Compact"/>
             </w:pPr>
-            <w:hyperlink r:id="rId95">
+            <w:hyperlink r:id="rId107">
               <w:r>
                 <w:rPr>
                   <w:rStyle w:val="Hyperlink"/>
@@ -17919,7 +18160,7 @@
             <w:pPr>
               <w:pStyle w:val="Compact"/>
             </w:pPr>
-            <w:hyperlink r:id="rId96">
+            <w:hyperlink r:id="rId108">
               <w:r>
                 <w:rPr>
                   <w:rStyle w:val="Hyperlink"/>
@@ -18110,7 +18351,7 @@
         </w:tc>
       </w:tr>
     </w:tbl>
-    <w:bookmarkEnd w:id="97"/>
+    <w:bookmarkEnd w:id="109"/>
     <w:sectPr>
       <w:footnotePr>
         <w:numRestart w:val="eachSect"/>

</xml_diff>

<commit_message>
docs: inbox/AAN — regenerate docx derivatives + series ZIP [aan-docx-regen]
</commit_message>
<xml_diff>
--- a/inbox/Application Aware Networking/Book_00_FedAAN_Executive_Summary.docx
+++ b/inbox/Application Aware Networking/Book_00_FedAAN_Executive_Summary.docx
@@ -114,7 +114,7 @@
                     <a:graphicData uri="http://schemas.openxmlformats.org/drawingml/2006/picture">
                       <pic:pic>
                         <pic:nvPicPr>
-                          <pic:cNvPr descr="C:\Program Files\Quarto\share\formats\docx\warning.png" id="11" name="Picture"/>
+                          <pic:cNvPr descr="/opt/quarto/share/formats/docx/warning.png" id="11" name="Picture"/>
                           <pic:cNvPicPr>
                             <a:picLocks noChangeArrowheads="1" noChangeAspect="1"/>
                           </pic:cNvPicPr>
@@ -943,7 +943,7 @@
         <w:t xml:space="preserve"> </w:t>
       </w:r>
       <w:r>
-        <w:t xml:space="preserve">— AT family cybersecurity training program — activates KSI-022 (KSI-CED-RAT), making all 29 FedRAMP 20x CR26 KSIs evaluable at high confidence.</w:t>
+        <w:t xml:space="preserve">— AT family cybersecurity training program — activates KSI-022 (KSI-CED-RAT), making all 29 KSI rules in the series’ ADR-111 rule set evaluable at high confidence.</w:t>
       </w:r>
     </w:p>
     <w:p>
@@ -961,7 +961,7 @@
         <w:t xml:space="preserve"> </w:t>
       </w:r>
       <w:r>
-        <w:t xml:space="preserve">— OSCAL AP+AR+POA&amp;M bundle (29/29 KSIs self-assessed, pending 3PAO validation), continuous monitoring program, and BOD 26-04 VDR/VER submission — closing CA-2, CA-5, CA-6, CA-7, RA-3, and SA-15.</w:t>
+        <w:t xml:space="preserve">— OSCAL AP+AR+POA&amp;M bundle (29/29 rules self-assessed, pending independent security control assessment (SCA)), continuous monitoring program, and BOD 26-04 VDR/VER submission — closing CA-2, CA-5, CA-6, CA-7, RA-3, and SA-15.</w:t>
       </w:r>
     </w:p>
     <w:p>
@@ -980,13 +980,13 @@
           <w:b/>
           <w:bCs/>
         </w:rPr>
-        <w:t xml:space="preserve">Together, the nineteen books constitute the complete evidence-generation and authorization layer required for FedRAMP 20x continuous monitoring authorization.</w:t>
-      </w:r>
-      <w:r>
-        <w:t xml:space="preserve"> </w:t>
-      </w:r>
-      <w:r>
-        <w:t xml:space="preserve">Each book maps its implementations directly to the NIST SP 800-53 Rev 5 controls it closes, and Book 19 assembles those mappings into a machine-readable OSCAL authorization package ready for 3PAO validation.</w:t>
+        <w:t xml:space="preserve">Together, the nineteen books constitute the complete evidence-generation and authorization-package layer for the agency’s RMF authorization, with continuous-monitoring evidence structured in the FedRAMP 20x KSI idiom.</w:t>
+      </w:r>
+      <w:r>
+        <w:t xml:space="preserve"> </w:t>
+      </w:r>
+      <w:r>
+        <w:t xml:space="preserve">Each book maps its implementations directly to the NIST SP 800-53 Rev 5 controls it closes, and Book 19 assembles those mappings into a machine-readable OSCAL authorization package ready for independent SCA. The FedRAMP cloud services SSA consumes (M365 GCC, AWS GovCloud, DDI SaaS) are inherited as leveraged authorizations; SSA itself does not submit to the FedRAMP PMO.</w:t>
       </w:r>
     </w:p>
     <w:p>
@@ -1058,7 +1058,7 @@
         <w:t xml:space="preserve"> </w:t>
       </w:r>
       <w:r>
-        <w:t xml:space="preserve">(the distributed policy enforcement that makes direct internet access lawful). The Closure Necessity Doctrine below states the claim; the KSI Closure Necessity Matrix quantifies it against all 29 FedRAMP 20x KSI rules.</w:t>
+        <w:t xml:space="preserve">(the distributed policy enforcement that makes direct internet access lawful). The Closure Necessity Doctrine below states the claim; the KSI Closure Necessity Matrix quantifies it against all 29 KSI rules in the series’ ADR-111 rule set.</w:t>
       </w:r>
     </w:p>
     <w:p>
@@ -1100,7 +1100,7 @@
         <w:t xml:space="preserve"> </w:t>
       </w:r>
       <w:r>
-        <w:t xml:space="preserve">They are the structural prerequisites for operating at FedRAMP Moderate authorization under FedRAMP 20x rules, which are mandatory for all certified systems effective January 1, 2027.</w:t>
+        <w:t xml:space="preserve">They are the structural prerequisites for an agency Moderate authorization whose evidence survives the FedRAMP 20x transition. CR26 is mandatory for the cloud service offerings SSA inherits effective January 1, 2027; SSA’s obligation is to ensure inherited services are on the 20x path and to structure its own ConMon evidence on the same KSI schema so inheritance stays clean.</w:t>
       </w:r>
     </w:p>
     <w:p>
@@ -2104,7 +2104,7 @@
               <w:pStyle w:val="Compact"/>
             </w:pPr>
             <w:r>
-              <w:t xml:space="preserve">FedRAMP 20x authorization package · OSCAL AP+AR+POA&amp;M bundle · BOD 26-04 VDR/VER submission · CA-7 ConMon program</w:t>
+              <w:t xml:space="preserve">Agency RMF authorization package (ConMon evidence modeled on the FedRAMP 20x KSI schema) · OSCAL AP+AR+POA&amp;M bundle · BOD 26-04 VDR/VER submission · CA-7 ConMon program</w:t>
             </w:r>
           </w:p>
         </w:tc>
@@ -2368,7 +2368,7 @@
               <w:pStyle w:val="Compact"/>
             </w:pPr>
             <w:r>
-              <w:t xml:space="preserve">GCC Moderate systems can begin</w:t>
+              <w:t xml:space="preserve">Class C (Moderate) CSO certifications open — the pipeline SSA’s inherited providers enter</w:t>
             </w:r>
           </w:p>
         </w:tc>
@@ -3770,7 +3770,7 @@
         <w:t xml:space="preserve"> </w:t>
       </w:r>
       <w:r>
-        <w:t xml:space="preserve">These closure claims are made against the NIST SP 800-53 Rev 5 control baseline and FedRAMP 20x CR26 rules effective June 25, 2026. Changes to the control baseline, new FedRAMP-authorized product entries, or revised assessment guidance may alter these closure paths. Validate with OIS and the agency’s 3PAO before using these claims as the basis for authorization decisions.</w:t>
+        <w:t xml:space="preserve">These closure claims are made against the NIST SP 800-53 Rev 5 control baseline and FedRAMP 20x CR26 rules effective June 25, 2026. Changes to the control baseline, new FedRAMP-authorized product entries, or revised assessment guidance may alter these closure paths. Validate with OIS and the agency’s independent assessor before using these claims as the basis for authorization decisions.</w:t>
       </w:r>
     </w:p>
     <w:tbl>
@@ -3819,7 +3819,7 @@
                     <a:graphicData uri="http://schemas.openxmlformats.org/drawingml/2006/picture">
                       <pic:pic>
                         <pic:nvPicPr>
-                          <pic:cNvPr descr="C:\Program Files\Quarto\share\formats\docx\important.png" id="25" name="Picture"/>
+                          <pic:cNvPr descr="/opt/quarto/share/formats/docx/important.png" id="25" name="Picture"/>
                           <pic:cNvPicPr>
                             <a:picLocks noChangeArrowheads="1" noChangeAspect="1"/>
                           </pic:cNvPicPr>
@@ -4112,7 +4112,7 @@
                     <a:graphicData uri="http://schemas.openxmlformats.org/drawingml/2006/picture">
                       <pic:pic>
                         <pic:nvPicPr>
-                          <pic:cNvPr descr="C:\Program Files\Quarto\share\formats\docx\important.png" id="27" name="Picture"/>
+                          <pic:cNvPr descr="/opt/quarto/share/formats/docx/important.png" id="27" name="Picture"/>
                           <pic:cNvPicPr>
                             <a:picLocks noChangeArrowheads="1" noChangeAspect="1"/>
                           </pic:cNvPicPr>
@@ -5538,7 +5538,7 @@
                     <a:graphicData uri="http://schemas.openxmlformats.org/drawingml/2006/picture">
                       <pic:pic>
                         <pic:nvPicPr>
-                          <pic:cNvPr descr="C:\Program Files\Quarto\share\formats\docx\note.png" id="40" name="Picture"/>
+                          <pic:cNvPr descr="/opt/quarto/share/formats/docx/note.png" id="40" name="Picture"/>
                           <pic:cNvPicPr>
                             <a:picLocks noChangeArrowheads="1" noChangeAspect="1"/>
                           </pic:cNvPicPr>
@@ -5601,7 +5601,7 @@
               <w:spacing w:before="16" w:after="16"/>
             </w:pPr>
             <w:r>
-              <w:t xml:space="preserve">SD-WAN and SASE SSE vendor selections are pending agency procurement review. The shortlists in this series reflect FedRAMP authorization status and federal use-case alignment at time of writing. Final selection requires validation against current FedRAMP Marketplace listings, agency-specific environment testing, and applicable procurement authority. All KSI self-assessments are self-assessed pending independent 3PAO validation.</w:t>
+              <w:t xml:space="preserve">SD-WAN and SASE SSE vendor selections are pending agency procurement review. The shortlists in this series reflect FedRAMP authorization status and federal use-case alignment at time of writing. Final selection requires validation against current FedRAMP Marketplace listings, agency-specific environment testing, and applicable procurement authority. All KSI self-assessments are self-assessed pending independent security control assessment (SCA).</w:t>
             </w:r>
           </w:p>
           <w:p/>
@@ -6324,31 +6324,109 @@
         <w:pStyle w:val="FirstParagraph"/>
       </w:pPr>
       <w:r>
-        <w:t xml:space="preserve">The authoritative closure-necessity view for all 29 FedRAMP 20x CR26 KSI rules.</w:t>
-      </w:r>
-      <w:r>
-        <w:t xml:space="preserve"> </w:t>
-      </w:r>
-      <w:r>
-        <w:t xml:space="preserve">Each row states what closes the rule set, whether conformance tooling alone can</w:t>
-      </w:r>
-      <w:r>
-        <w:t xml:space="preserve"> </w:t>
-      </w:r>
-      <w:r>
-        <w:t xml:space="preserve">attest it, and which evidence slot and series part carry it. Book 19 documents</w:t>
-      </w:r>
-      <w:r>
-        <w:t xml:space="preserve"> </w:t>
-      </w:r>
-      <w:r>
-        <w:t xml:space="preserve">the evidence procedures; this matrix is the citable summary. All verdicts are</w:t>
-      </w:r>
-      <w:r>
-        <w:t xml:space="preserve"> </w:t>
-      </w:r>
-      <w:r>
-        <w:t xml:space="preserve">self-assessed pending independent 3PAO validation.</w:t>
+        <w:t xml:space="preserve">The authoritative closure-necessity view for all 29 KSI rules in the series’</w:t>
+      </w:r>
+      <w:r>
+        <w:t xml:space="preserve"> </w:t>
+      </w:r>
+      <w:r>
+        <w:t xml:space="preserve">ADR-111 rule set. Each row states what closes the rule set, whether conformance</w:t>
+      </w:r>
+      <w:r>
+        <w:t xml:space="preserve"> </w:t>
+      </w:r>
+      <w:r>
+        <w:t xml:space="preserve">tooling alone can attest it, and which evidence slot and series part carry it.</w:t>
+      </w:r>
+      <w:r>
+        <w:t xml:space="preserve"> </w:t>
+      </w:r>
+      <w:r>
+        <w:t xml:space="preserve">Book 19 documents the evidence procedures; this matrix is the citable summary.</w:t>
+      </w:r>
+      <w:r>
+        <w:t xml:space="preserve"> </w:t>
+      </w:r>
+      <w:r>
+        <w:t xml:space="preserve">All verdicts are self-assessed pending independent security control assessment</w:t>
+      </w:r>
+      <w:r>
+        <w:t xml:space="preserve"> </w:t>
+      </w:r>
+      <w:r>
+        <w:t xml:space="preserve">(SCA).</w:t>
+      </w:r>
+    </w:p>
+    <w:p>
+      <w:pPr>
+        <w:pStyle w:val="BlockText"/>
+      </w:pPr>
+      <w:r>
+        <w:rPr>
+          <w:b/>
+          <w:bCs/>
+        </w:rPr>
+        <w:t xml:space="preserve">KSI-count reconciliation (open item).</w:t>
+      </w:r>
+      <w:r>
+        <w:t xml:space="preserve"> </w:t>
+      </w:r>
+      <w:r>
+        <w:t xml:space="preserve">The 29 rules in this matrix are the</w:t>
+      </w:r>
+      <w:r>
+        <w:t xml:space="preserve"> </w:t>
+      </w:r>
+      <w:r>
+        <w:t xml:space="preserve">ADR-111 rule decomposition, not the published CR26 Moderate KSI catalog</w:t>
+      </w:r>
+      <w:r>
+        <w:t xml:space="preserve"> </w:t>
+      </w:r>
+      <w:r>
+        <w:t xml:space="preserve">(~56–63 indicators across the same 10 theme codes, depending on counting</w:t>
+      </w:r>
+      <w:r>
+        <w:t xml:space="preserve"> </w:t>
+      </w:r>
+      <w:r>
+        <w:t xml:space="preserve">method). Before any coverage claim is carried into an authorization decision,</w:t>
+      </w:r>
+      <w:r>
+        <w:t xml:space="preserve"> </w:t>
+      </w:r>
+      <w:r>
+        <w:t xml:space="preserve">the 29-rule set must be diffed rule-ID-by-rule-ID against the finalized CR26</w:t>
+      </w:r>
+      <w:r>
+        <w:t xml:space="preserve"> </w:t>
+      </w:r>
+      <w:r>
+        <w:t xml:space="preserve">Moderate list (June 25, 2026) and the mapping stated explicitly. Until that</w:t>
+      </w:r>
+      <w:r>
+        <w:t xml:space="preserve"> </w:t>
+      </w:r>
+      <w:r>
+        <w:t xml:space="preserve">reconciliation is documented,</w:t>
+      </w:r>
+      <w:r>
+        <w:t xml:space="preserve"> </w:t>
+      </w:r>
+      <w:r>
+        <w:t xml:space="preserve">“29/29 satisfied”</w:t>
+      </w:r>
+      <w:r>
+        <w:t xml:space="preserve"> </w:t>
+      </w:r>
+      <w:r>
+        <w:t xml:space="preserve">is a claim about the internal</w:t>
+      </w:r>
+      <w:r>
+        <w:t xml:space="preserve"> </w:t>
+      </w:r>
+      <w:r>
+        <w:t xml:space="preserve">rule set — not about the full CR26 indicator set.</w:t>
       </w:r>
     </w:p>
     <w:p>
@@ -7738,7 +7816,7 @@
                     <a:graphicData uri="http://schemas.openxmlformats.org/drawingml/2006/picture">
                       <pic:pic>
                         <pic:nvPicPr>
-                          <pic:cNvPr descr="C:\Program Files\Quarto\share\formats\docx\note.png" id="50" name="Picture"/>
+                          <pic:cNvPr descr="/opt/quarto/share/formats/docx/note.png" id="50" name="Picture"/>
                           <pic:cNvPicPr>
                             <a:picLocks noChangeArrowheads="1" noChangeAspect="1"/>
                           </pic:cNvPicPr>
@@ -17648,7 +17726,7 @@
         <w:t xml:space="preserve"> </w:t>
       </w:r>
       <w:r>
-        <w:t xml:space="preserve">FedRAMP 20x Consolidated Rules are mandatory for all certified systems on January 1, 2027. New Rev 5 certifications cease June 11, 2027. Agencies that have not begun the transition to machine-readable KSI evidence by Q3 2026 will face authorization gaps at renewal. All tracks must be in active implementation — not in planning — by Q4 2026.</w:t>
+        <w:t xml:space="preserve">FedRAMP 20x Consolidated Rules are mandatory on January 1, 2027 for the certified cloud service offerings SSA inherits. New Rev 5 certifications cease June 11, 2027. An agency whose inherited services transition to machine-readable KSI evidence while its own ConMon evidence stays manual will face inheritance friction at renewal — which is why this series structures agency evidence on the same KSI schema. All tracks must be in active implementation — not in planning — by Q4 2026.</w:t>
       </w:r>
     </w:p>
     <w:p>
@@ -17669,10 +17747,86 @@
     </w:p>
     <w:p>
       <w:pPr>
+        <w:pStyle w:val="FirstParagraph"/>
+      </w:pPr>
+      <w:r>
+        <w:t xml:space="preserve">The roadmap tracks two things that must not be conflated:</w:t>
+      </w:r>
+      <w:r>
+        <w:t xml:space="preserve"> </w:t>
+      </w:r>
+      <w:r>
+        <w:rPr>
+          <w:b/>
+          <w:bCs/>
+        </w:rPr>
+        <w:t xml:space="preserve">authoring</w:t>
+      </w:r>
+      <w:r>
+        <w:t xml:space="preserve"> </w:t>
+      </w:r>
+      <w:r>
+        <w:t xml:space="preserve">(the</w:t>
+      </w:r>
+      <w:r>
+        <w:t xml:space="preserve"> </w:t>
+      </w:r>
+      <w:r>
+        <w:t xml:space="preserve">books, templates, and evidence pipeline — complete as of July 2026) and</w:t>
+      </w:r>
+      <w:r>
+        <w:t xml:space="preserve"> </w:t>
+      </w:r>
+      <w:r>
+        <w:rPr>
+          <w:b/>
+          <w:bCs/>
+        </w:rPr>
+        <w:t xml:space="preserve">implementation</w:t>
+      </w:r>
+      <w:r>
+        <w:t xml:space="preserve"> </w:t>
+      </w:r>
+      <w:r>
+        <w:t xml:space="preserve">(deployment against the estate — not started; draft pending</w:t>
+      </w:r>
+      <w:r>
+        <w:t xml:space="preserve"> </w:t>
+      </w:r>
+      <w:r>
+        <w:t xml:space="preserve">OIS review). Phase dates below are implementation milestones;</w:t>
+      </w:r>
+      <w:r>
+        <w:t xml:space="preserve"> </w:t>
+      </w:r>
+      <w:r>
+        <w:t xml:space="preserve">“Authored”</w:t>
+      </w:r>
+      <w:r>
+        <w:t xml:space="preserve"> </w:t>
+      </w:r>
+      <w:r>
+        <w:t xml:space="preserve">means</w:t>
+      </w:r>
+      <w:r>
+        <w:t xml:space="preserve"> </w:t>
+      </w:r>
+      <w:r>
+        <w:t xml:space="preserve">the deliverable documents and tooling exist, not that the milestone has been</w:t>
+      </w:r>
+      <w:r>
+        <w:t xml:space="preserve"> </w:t>
+      </w:r>
+      <w:r>
+        <w:t xml:space="preserve">executed.</w:t>
+      </w:r>
+    </w:p>
+    <w:p>
+      <w:pPr>
         <w:pStyle w:val="TableCaption"/>
       </w:pPr>
       <w:r>
-        <w:t xml:space="preserve">Phased Delivery Roadmap — Phase 0 through Phase 6</w:t>
+        <w:t xml:space="preserve">Phased Delivery Roadmap — Phase 0 through Phase 6 (authoring vs. implementation)</w:t>
       </w:r>
     </w:p>
     <w:tbl>
@@ -17681,13 +17835,14 @@
         <w:tblW w:type="pct" w:w="5000"/>
         <w:tblLayout w:type="fixed"/>
         <w:tblLook w:firstRow="1" w:lastRow="0" w:firstColumn="0" w:lastColumn="0" w:noHBand="0" w:noVBand="0" w:val="0020"/>
-        <w:tblCaption w:val="Phased Delivery Roadmap — Phase 0 through Phase 6"/>
+        <w:tblCaption w:val="Phased Delivery Roadmap — Phase 0 through Phase 6 (authoring vs. implementation)"/>
       </w:tblPr>
       <w:tblGrid>
-        <w:gridCol w:w="1421"/>
-        <w:gridCol w:w="2030"/>
-        <w:gridCol w:w="1624"/>
-        <w:gridCol w:w="2843"/>
+        <w:gridCol w:w="955"/>
+        <w:gridCol w:w="1365"/>
+        <w:gridCol w:w="1502"/>
+        <w:gridCol w:w="2184"/>
+        <w:gridCol w:w="1911"/>
       </w:tblGrid>
       <w:tr>
         <w:trPr>
@@ -17722,7 +17877,18 @@
               <w:pStyle w:val="Compact"/>
             </w:pPr>
             <w:r>
-              <w:t xml:space="preserve">Status</w:t>
+              <w:t xml:space="preserve">Authoring</w:t>
+            </w:r>
+          </w:p>
+        </w:tc>
+        <w:tc>
+          <w:tcPr/>
+          <w:p>
+            <w:pPr>
+              <w:pStyle w:val="Compact"/>
+            </w:pPr>
+            <w:r>
+              <w:t xml:space="preserve">Implementation</w:t>
             </w:r>
           </w:p>
         </w:tc>
@@ -17783,6 +17949,17 @@
               <w:pStyle w:val="Compact"/>
             </w:pPr>
             <w:r>
+              <w:t xml:space="preserve">⬜ Not started</w:t>
+            </w:r>
+          </w:p>
+        </w:tc>
+        <w:tc>
+          <w:tcPr/>
+          <w:p>
+            <w:pPr>
+              <w:pStyle w:val="Compact"/>
+            </w:pPr>
+            <w:r>
               <w:t xml:space="preserve">Parts 1 and 5–14 delivered; Conformance Adapter slots 1–4 bound</w:t>
             </w:r>
           </w:p>
@@ -17833,6 +18010,17 @@
               <w:pStyle w:val="Compact"/>
             </w:pPr>
             <w:r>
+              <w:t xml:space="preserve">⬜ Not started</w:t>
+            </w:r>
+          </w:p>
+        </w:tc>
+        <w:tc>
+          <w:tcPr/>
+          <w:p>
+            <w:pPr>
+              <w:pStyle w:val="Compact"/>
+            </w:pPr>
+            <w:r>
               <w:t xml:space="preserve">Part 15 SR/SBOM/VDR; Adapter SR slot bound; KSI-011–014 → active</w:t>
             </w:r>
           </w:p>
@@ -17883,6 +18071,17 @@
               <w:pStyle w:val="Compact"/>
             </w:pPr>
             <w:r>
+              <w:t xml:space="preserve">⬜ Not started</w:t>
+            </w:r>
+          </w:p>
+        </w:tc>
+        <w:tc>
+          <w:tcPr/>
+          <w:p>
+            <w:pPr>
+              <w:pStyle w:val="Compact"/>
+            </w:pPr>
+            <w:r>
               <w:t xml:space="preserve">OSCAL Emitter AR output; Part 16 PM governance artifacts; CR26 SR/PM rules</w:t>
             </w:r>
           </w:p>
@@ -17933,7 +18132,18 @@
               <w:pStyle w:val="Compact"/>
             </w:pPr>
             <w:r>
-              <w:t xml:space="preserve">Part 17 PT/PII templates; Part 18 AT training program; KSI-022 → active; all 29 CR26 KSIs evaluable</w:t>
+              <w:t xml:space="preserve">⬜ Not started</w:t>
+            </w:r>
+          </w:p>
+        </w:tc>
+        <w:tc>
+          <w:tcPr/>
+          <w:p>
+            <w:pPr>
+              <w:pStyle w:val="Compact"/>
+            </w:pPr>
+            <w:r>
+              <w:t xml:space="preserve">Part 17 PT/PII templates; Part 18 AT training program; KSI-022 → active; all 29 ADR-111 KSI rules evaluable</w:t>
             </w:r>
           </w:p>
         </w:tc>
@@ -17983,7 +18193,18 @@
               <w:pStyle w:val="Compact"/>
             </w:pPr>
             <w:r>
-              <w:t xml:space="preserve">BOD 26-04 VDR/VER submission (Dec 7); Authorization package filed; OSCAL AP+AR+POAM bundle (29/29 self-assessed, pending 3PAO validation)</w:t>
+              <w:t xml:space="preserve">⬜ Not started</w:t>
+            </w:r>
+          </w:p>
+        </w:tc>
+        <w:tc>
+          <w:tcPr/>
+          <w:p>
+            <w:pPr>
+              <w:pStyle w:val="Compact"/>
+            </w:pPr>
+            <w:r>
+              <w:t xml:space="preserve">BOD 26-04 VDR/VER submission (due Dec 7); Authorization package assembled for the SSA AO; OSCAL AP+AR+POAM bundle (29/29 self-assessed, pending independent SCA)</w:t>
             </w:r>
           </w:p>
         </w:tc>
@@ -18033,7 +18254,18 @@
               <w:pStyle w:val="Compact"/>
             </w:pPr>
             <w:r>
-              <w:t xml:space="preserve">FedRAMP 20x mandatory deadline; All 19 books operational; Continuous monitoring cadence established</w:t>
+              <w:t xml:space="preserve">⬜ Not started</w:t>
+            </w:r>
+          </w:p>
+        </w:tc>
+        <w:tc>
+          <w:tcPr/>
+          <w:p>
+            <w:pPr>
+              <w:pStyle w:val="Compact"/>
+            </w:pPr>
+            <w:r>
+              <w:t xml:space="preserve">CR26 mandatory for inherited CSOs; All 19 books operational; Continuous monitoring cadence established</w:t>
             </w:r>
           </w:p>
         </w:tc>
@@ -18072,7 +18304,18 @@
               <w:pStyle w:val="Compact"/>
             </w:pPr>
             <w:r>
-              <w:t xml:space="preserve">🔄 Active</w:t>
+              <w:t xml:space="preserve">✅ Complete</w:t>
+            </w:r>
+          </w:p>
+        </w:tc>
+        <w:tc>
+          <w:tcPr/>
+          <w:p>
+            <w:pPr>
+              <w:pStyle w:val="Compact"/>
+            </w:pPr>
+            <w:r>
+              <w:t xml:space="preserve">⬜ Not started</w:t>
             </w:r>
           </w:p>
         </w:tc>
@@ -18918,7 +19161,7 @@
               <w:pStyle w:val="Compact"/>
             </w:pPr>
             <w:r>
-              <w:t xml:space="preserve">Part 19: FedRAMP 20x authorization package structure, OSCAL AP+AR+POA&amp;M bundle (29/29 self-assessed, pending 3PAO validation), CA-7 ConMon program, BOD 26-04 VDR/VER submission, AO checklist, day-of-submission procedure</w:t>
+              <w:t xml:space="preserve">Part 19: authorization package structure, OSCAL AP+AR+POA&amp;M bundle (29/29 self-assessed, pending independent SCA), CA-7 ConMon program, BOD 26-04 VDR/VER submission, AO authorization checklist, authorization-decision procedure</w:t>
             </w:r>
           </w:p>
         </w:tc>

</xml_diff>